<commit_message>
Phase 2: generator+mapper+route+template patched with placeholders
</commit_message>
<xml_diff>
--- a/src/services/reports/uk/template.docx
+++ b/src/services/reports/uk/template.docx
@@ -1361,7 +1361,7 @@
                 <w:spacing w:val="-2"/>
                 <w:sz w:val="38"/>
               </w:rPr>
-              <w:t>0.0000</w:t>
+              <w:t>{{SCOPE1}}</w:t>
             </w:r>
           </w:p>
           <w:p>
@@ -1465,7 +1465,7 @@
                 <w:spacing w:val="-2"/>
                 <w:sz w:val="38"/>
               </w:rPr>
-              <w:t>0.1999</w:t>
+              <w:t>{{SCOPE2}}</w:t>
             </w:r>
           </w:p>
           <w:p>
@@ -1569,7 +1569,7 @@
                 <w:spacing w:val="-2"/>
                 <w:sz w:val="38"/>
               </w:rPr>
-              <w:t>0.0000</w:t>
+              <w:t>{{SCOPE1}}</w:t>
             </w:r>
           </w:p>
           <w:p>
@@ -1658,7 +1658,7 @@
                 <w:spacing w:val="-2"/>
                 <w:sz w:val="38"/>
               </w:rPr>
-              <w:t>0.1999</w:t>
+              <w:t>{{SCOPE2}}</w:t>
             </w:r>
           </w:p>
           <w:p>
@@ -2678,7 +2678,7 @@
                 <w:spacing w:val="-2"/>
                 <w:sz w:val="38"/>
               </w:rPr>
-              <w:t>0.0000</w:t>
+              <w:t>{{SCOPE1}}</w:t>
             </w:r>
           </w:p>
           <w:p>
@@ -2782,7 +2782,7 @@
                 <w:spacing w:val="-2"/>
                 <w:sz w:val="38"/>
               </w:rPr>
-              <w:t>0.1999</w:t>
+              <w:t>{{SCOPE2}}</w:t>
             </w:r>
           </w:p>
           <w:p>
@@ -2886,7 +2886,7 @@
                 <w:spacing w:val="-2"/>
                 <w:sz w:val="38"/>
               </w:rPr>
-              <w:t>0.0000</w:t>
+              <w:t>{{SCOPE1}}</w:t>
             </w:r>
           </w:p>
           <w:p>
@@ -2975,7 +2975,7 @@
                 <w:spacing w:val="-2"/>
                 <w:sz w:val="38"/>
               </w:rPr>
-              <w:t>0.1999</w:t>
+              <w:t>{{SCOPE2}}</w:t>
             </w:r>
           </w:p>
           <w:p>
@@ -3196,7 +3196,7 @@
                 <w:color w:val="151F34"/>
                 <w:sz w:val="17"/>
               </w:rPr>
-              <w:t>0.0000 </w:t>
+              <w:t>{{SCOPE1}} </w:t>
             </w:r>
             <w:r>
               <w:rPr>
@@ -3287,7 +3287,7 @@
                 <w:color w:val="151F34"/>
                 <w:sz w:val="17"/>
               </w:rPr>
-              <w:t>0.1999 </w:t>
+              <w:t>{{SCOPE2}} </w:t>
             </w:r>
             <w:r>
               <w:rPr>
@@ -3377,7 +3377,7 @@
                 <w:color w:val="151F34"/>
                 <w:sz w:val="17"/>
               </w:rPr>
-              <w:t>0.0000 </w:t>
+              <w:t>{{SCOPE1}} </w:t>
             </w:r>
             <w:r>
               <w:rPr>
@@ -3461,7 +3461,7 @@
                 <w:color w:val="151F34"/>
                 <w:sz w:val="17"/>
               </w:rPr>
-              <w:t>0.1999 </w:t>
+              <w:t>{{SCOPE2}} </w:t>
             </w:r>
             <w:r>
               <w:rPr>
@@ -4016,7 +4016,7 @@
                 <w:spacing w:val="-2"/>
                 <w:sz w:val="38"/>
               </w:rPr>
-              <w:t>0.0000</w:t>
+              <w:t>{{SCOPE1}}</w:t>
             </w:r>
           </w:p>
           <w:p>
@@ -4120,7 +4120,7 @@
                 <w:spacing w:val="-2"/>
                 <w:sz w:val="38"/>
               </w:rPr>
-              <w:t>0.1999</w:t>
+              <w:t>{{SCOPE2}}</w:t>
             </w:r>
           </w:p>
           <w:p>
@@ -4224,7 +4224,7 @@
                 <w:spacing w:val="-2"/>
                 <w:sz w:val="38"/>
               </w:rPr>
-              <w:t>0.0000</w:t>
+              <w:t>{{SCOPE1}}</w:t>
             </w:r>
           </w:p>
           <w:p>
@@ -4313,7 +4313,7 @@
                 <w:spacing w:val="-2"/>
                 <w:sz w:val="38"/>
               </w:rPr>
-              <w:t>0.1999</w:t>
+              <w:t>{{SCOPE2}}</w:t>
             </w:r>
           </w:p>
           <w:p>
@@ -5425,7 +5425,7 @@
                 <w:spacing w:val="-2"/>
                 <w:sz w:val="38"/>
               </w:rPr>
-              <w:t>0.0000</w:t>
+              <w:t>{{SCOPE1}}</w:t>
             </w:r>
           </w:p>
           <w:p>
@@ -5529,7 +5529,7 @@
                 <w:spacing w:val="-2"/>
                 <w:sz w:val="38"/>
               </w:rPr>
-              <w:t>0.1999</w:t>
+              <w:t>{{SCOPE2}}</w:t>
             </w:r>
           </w:p>
           <w:p>
@@ -5633,7 +5633,7 @@
                 <w:spacing w:val="-2"/>
                 <w:sz w:val="38"/>
               </w:rPr>
-              <w:t>0.0000</w:t>
+              <w:t>{{SCOPE1}}</w:t>
             </w:r>
           </w:p>
           <w:p>
@@ -5722,7 +5722,7 @@
                 <w:spacing w:val="-2"/>
                 <w:sz w:val="38"/>
               </w:rPr>
-              <w:t>0.1999</w:t>
+              <w:t>{{SCOPE2}}</w:t>
             </w:r>
           </w:p>
           <w:p>
@@ -6742,7 +6742,7 @@
                 <w:spacing w:val="-2"/>
                 <w:sz w:val="38"/>
               </w:rPr>
-              <w:t>0.0000</w:t>
+              <w:t>{{SCOPE1}}</w:t>
             </w:r>
           </w:p>
           <w:p>
@@ -6846,7 +6846,7 @@
                 <w:spacing w:val="-2"/>
                 <w:sz w:val="38"/>
               </w:rPr>
-              <w:t>0.1999</w:t>
+              <w:t>{{SCOPE2}}</w:t>
             </w:r>
           </w:p>
           <w:p>
@@ -6950,7 +6950,7 @@
                 <w:spacing w:val="-2"/>
                 <w:sz w:val="38"/>
               </w:rPr>
-              <w:t>0.0000</w:t>
+              <w:t>{{SCOPE1}}</w:t>
             </w:r>
           </w:p>
           <w:p>
@@ -7039,7 +7039,7 @@
                 <w:spacing w:val="-2"/>
                 <w:sz w:val="38"/>
               </w:rPr>
-              <w:t>0.1999</w:t>
+              <w:t>{{SCOPE2}}</w:t>
             </w:r>
           </w:p>
           <w:p>
@@ -8059,7 +8059,7 @@
                 <w:spacing w:val="-2"/>
                 <w:sz w:val="38"/>
               </w:rPr>
-              <w:t>0.0000</w:t>
+              <w:t>{{SCOPE1}}</w:t>
             </w:r>
           </w:p>
           <w:p>
@@ -8163,7 +8163,7 @@
                 <w:spacing w:val="-2"/>
                 <w:sz w:val="38"/>
               </w:rPr>
-              <w:t>0.1999</w:t>
+              <w:t>{{SCOPE2}}</w:t>
             </w:r>
           </w:p>
           <w:p>
@@ -8267,7 +8267,7 @@
                 <w:spacing w:val="-2"/>
                 <w:sz w:val="38"/>
               </w:rPr>
-              <w:t>0.0000</w:t>
+              <w:t>{{SCOPE1}}</w:t>
             </w:r>
           </w:p>
           <w:p>
@@ -8356,7 +8356,7 @@
                 <w:spacing w:val="-2"/>
                 <w:sz w:val="38"/>
               </w:rPr>
-              <w:t>0.1999</w:t>
+              <w:t>{{SCOPE2}}</w:t>
             </w:r>
           </w:p>
           <w:p>
@@ -9376,7 +9376,7 @@
                 <w:spacing w:val="-2"/>
                 <w:sz w:val="38"/>
               </w:rPr>
-              <w:t>0.0000</w:t>
+              <w:t>{{SCOPE1}}</w:t>
             </w:r>
           </w:p>
           <w:p>
@@ -9480,7 +9480,7 @@
                 <w:spacing w:val="-2"/>
                 <w:sz w:val="38"/>
               </w:rPr>
-              <w:t>0.1999</w:t>
+              <w:t>{{SCOPE2}}</w:t>
             </w:r>
           </w:p>
           <w:p>
@@ -9584,7 +9584,7 @@
                 <w:spacing w:val="-2"/>
                 <w:sz w:val="38"/>
               </w:rPr>
-              <w:t>0.0000</w:t>
+              <w:t>{{SCOPE1}}</w:t>
             </w:r>
           </w:p>
           <w:p>
@@ -9673,7 +9673,7 @@
                 <w:spacing w:val="-2"/>
                 <w:sz w:val="38"/>
               </w:rPr>
-              <w:t>0.1999</w:t>
+              <w:t>{{SCOPE2}}</w:t>
             </w:r>
           </w:p>
           <w:p>
@@ -9985,7 +9985,7 @@
                 <w:color w:val="151F34"/>
                 <w:sz w:val="17"/>
               </w:rPr>
-              <w:t>0.0000 </w:t>
+              <w:t>{{SCOPE1}} </w:t>
             </w:r>
             <w:r>
               <w:rPr>
@@ -10075,7 +10075,7 @@
                 <w:color w:val="151F34"/>
                 <w:sz w:val="17"/>
               </w:rPr>
-              <w:t>0.1999 </w:t>
+              <w:t>{{SCOPE2}} </w:t>
             </w:r>
             <w:r>
               <w:rPr>
@@ -10166,7 +10166,7 @@
                 <w:color w:val="151F34"/>
                 <w:sz w:val="17"/>
               </w:rPr>
-              <w:t>0.1999 tCO2e / </w:t>
+              <w:t>{{SCOPE2}} tCO2e / </w:t>
             </w:r>
             <w:r>
               <w:rPr>
@@ -10721,7 +10721,7 @@
                 <w:spacing w:val="-2"/>
                 <w:sz w:val="38"/>
               </w:rPr>
-              <w:t>0.0000</w:t>
+              <w:t>{{SCOPE1}}</w:t>
             </w:r>
           </w:p>
           <w:p>
@@ -10825,7 +10825,7 @@
                 <w:spacing w:val="-2"/>
                 <w:sz w:val="38"/>
               </w:rPr>
-              <w:t>0.1999</w:t>
+              <w:t>{{SCOPE2}}</w:t>
             </w:r>
           </w:p>
           <w:p>
@@ -10929,7 +10929,7 @@
                 <w:spacing w:val="-2"/>
                 <w:sz w:val="38"/>
               </w:rPr>
-              <w:t>0.0000</w:t>
+              <w:t>{{SCOPE1}}</w:t>
             </w:r>
           </w:p>
           <w:p>
@@ -11018,7 +11018,7 @@
                 <w:spacing w:val="-2"/>
                 <w:sz w:val="38"/>
               </w:rPr>
-              <w:t>0.1999</w:t>
+              <w:t>{{SCOPE2}}</w:t>
             </w:r>
           </w:p>
           <w:p>
@@ -12038,7 +12038,7 @@
                 <w:spacing w:val="-2"/>
                 <w:sz w:val="38"/>
               </w:rPr>
-              <w:t>0.0000</w:t>
+              <w:t>{{SCOPE1}}</w:t>
             </w:r>
           </w:p>
           <w:p>
@@ -12142,7 +12142,7 @@
                 <w:spacing w:val="-2"/>
                 <w:sz w:val="38"/>
               </w:rPr>
-              <w:t>0.1999</w:t>
+              <w:t>{{SCOPE2}}</w:t>
             </w:r>
           </w:p>
           <w:p>
@@ -12246,7 +12246,7 @@
                 <w:spacing w:val="-2"/>
                 <w:sz w:val="38"/>
               </w:rPr>
-              <w:t>0.0000</w:t>
+              <w:t>{{SCOPE1}}</w:t>
             </w:r>
           </w:p>
           <w:p>
@@ -12335,7 +12335,7 @@
                 <w:spacing w:val="-2"/>
                 <w:sz w:val="38"/>
               </w:rPr>
-              <w:t>0.1999</w:t>
+              <w:t>{{SCOPE2}}</w:t>
             </w:r>
           </w:p>
           <w:p>
@@ -13355,7 +13355,7 @@
                 <w:spacing w:val="-2"/>
                 <w:sz w:val="38"/>
               </w:rPr>
-              <w:t>0.0000</w:t>
+              <w:t>{{SCOPE1}}</w:t>
             </w:r>
           </w:p>
           <w:p>
@@ -13459,7 +13459,7 @@
                 <w:spacing w:val="-2"/>
                 <w:sz w:val="38"/>
               </w:rPr>
-              <w:t>0.1999</w:t>
+              <w:t>{{SCOPE2}}</w:t>
             </w:r>
           </w:p>
           <w:p>
@@ -13563,7 +13563,7 @@
                 <w:spacing w:val="-2"/>
                 <w:sz w:val="38"/>
               </w:rPr>
-              <w:t>0.0000</w:t>
+              <w:t>{{SCOPE1}}</w:t>
             </w:r>
           </w:p>
           <w:p>
@@ -13652,7 +13652,7 @@
                 <w:spacing w:val="-2"/>
                 <w:sz w:val="38"/>
               </w:rPr>
-              <w:t>0.1999</w:t>
+              <w:t>{{SCOPE2}}</w:t>
             </w:r>
           </w:p>
           <w:p>
@@ -14672,7 +14672,7 @@
                 <w:spacing w:val="-2"/>
                 <w:sz w:val="38"/>
               </w:rPr>
-              <w:t>0.0000</w:t>
+              <w:t>{{SCOPE1}}</w:t>
             </w:r>
           </w:p>
           <w:p>
@@ -14776,7 +14776,7 @@
                 <w:spacing w:val="-2"/>
                 <w:sz w:val="38"/>
               </w:rPr>
-              <w:t>0.1999</w:t>
+              <w:t>{{SCOPE2}}</w:t>
             </w:r>
           </w:p>
           <w:p>
@@ -14880,7 +14880,7 @@
                 <w:spacing w:val="-2"/>
                 <w:sz w:val="38"/>
               </w:rPr>
-              <w:t>0.0000</w:t>
+              <w:t>{{SCOPE1}}</w:t>
             </w:r>
           </w:p>
           <w:p>
@@ -14969,7 +14969,7 @@
                 <w:spacing w:val="-2"/>
                 <w:sz w:val="38"/>
               </w:rPr>
-              <w:t>0.1999</w:t>
+              <w:t>{{SCOPE2}}</w:t>
             </w:r>
           </w:p>
           <w:p>
@@ -15989,7 +15989,7 @@
                 <w:spacing w:val="-2"/>
                 <w:sz w:val="38"/>
               </w:rPr>
-              <w:t>0.0000</w:t>
+              <w:t>{{SCOPE1}}</w:t>
             </w:r>
           </w:p>
           <w:p>
@@ -16093,7 +16093,7 @@
                 <w:spacing w:val="-2"/>
                 <w:sz w:val="38"/>
               </w:rPr>
-              <w:t>0.1999</w:t>
+              <w:t>{{SCOPE2}}</w:t>
             </w:r>
           </w:p>
           <w:p>
@@ -16197,7 +16197,7 @@
                 <w:spacing w:val="-2"/>
                 <w:sz w:val="38"/>
               </w:rPr>
-              <w:t>0.0000</w:t>
+              <w:t>{{SCOPE1}}</w:t>
             </w:r>
           </w:p>
           <w:p>
@@ -16286,7 +16286,7 @@
                 <w:spacing w:val="-2"/>
                 <w:sz w:val="38"/>
               </w:rPr>
-              <w:t>0.1999</w:t>
+              <w:t>{{SCOPE2}}</w:t>
             </w:r>
           </w:p>
           <w:p>
@@ -17306,7 +17306,7 @@
                 <w:spacing w:val="-2"/>
                 <w:sz w:val="38"/>
               </w:rPr>
-              <w:t>0.0000</w:t>
+              <w:t>{{SCOPE1}}</w:t>
             </w:r>
           </w:p>
           <w:p>
@@ -17410,7 +17410,7 @@
                 <w:spacing w:val="-2"/>
                 <w:sz w:val="38"/>
               </w:rPr>
-              <w:t>0.1999</w:t>
+              <w:t>{{SCOPE2}}</w:t>
             </w:r>
           </w:p>
           <w:p>
@@ -17514,7 +17514,7 @@
                 <w:spacing w:val="-2"/>
                 <w:sz w:val="38"/>
               </w:rPr>
-              <w:t>0.0000</w:t>
+              <w:t>{{SCOPE1}}</w:t>
             </w:r>
           </w:p>
           <w:p>
@@ -17603,7 +17603,7 @@
                 <w:spacing w:val="-2"/>
                 <w:sz w:val="38"/>
               </w:rPr>
-              <w:t>0.1999</w:t>
+              <w:t>{{SCOPE2}}</w:t>
             </w:r>
           </w:p>
           <w:p>
@@ -18623,7 +18623,7 @@
                 <w:spacing w:val="-2"/>
                 <w:sz w:val="38"/>
               </w:rPr>
-              <w:t>0.0000</w:t>
+              <w:t>{{SCOPE1}}</w:t>
             </w:r>
           </w:p>
           <w:p>
@@ -18727,7 +18727,7 @@
                 <w:spacing w:val="-2"/>
                 <w:sz w:val="38"/>
               </w:rPr>
-              <w:t>0.1999</w:t>
+              <w:t>{{SCOPE2}}</w:t>
             </w:r>
           </w:p>
           <w:p>
@@ -18831,7 +18831,7 @@
                 <w:spacing w:val="-2"/>
                 <w:sz w:val="38"/>
               </w:rPr>
-              <w:t>0.0000</w:t>
+              <w:t>{{SCOPE1}}</w:t>
             </w:r>
           </w:p>
           <w:p>
@@ -18920,7 +18920,7 @@
                 <w:spacing w:val="-2"/>
                 <w:sz w:val="38"/>
               </w:rPr>
-              <w:t>0.1999</w:t>
+              <w:t>{{SCOPE2}}</w:t>
             </w:r>
           </w:p>
           <w:p>
@@ -19940,7 +19940,7 @@
                 <w:spacing w:val="-2"/>
                 <w:sz w:val="38"/>
               </w:rPr>
-              <w:t>0.0000</w:t>
+              <w:t>{{SCOPE1}}</w:t>
             </w:r>
           </w:p>
           <w:p>
@@ -20044,7 +20044,7 @@
                 <w:spacing w:val="-2"/>
                 <w:sz w:val="38"/>
               </w:rPr>
-              <w:t>0.1999</w:t>
+              <w:t>{{SCOPE2}}</w:t>
             </w:r>
           </w:p>
           <w:p>
@@ -20148,7 +20148,7 @@
                 <w:spacing w:val="-2"/>
                 <w:sz w:val="38"/>
               </w:rPr>
-              <w:t>0.0000</w:t>
+              <w:t>{{SCOPE1}}</w:t>
             </w:r>
           </w:p>
           <w:p>
@@ -20237,7 +20237,7 @@
                 <w:spacing w:val="-2"/>
                 <w:sz w:val="38"/>
               </w:rPr>
-              <w:t>0.1999</w:t>
+              <w:t>{{SCOPE2}}</w:t>
             </w:r>
           </w:p>
           <w:p>
@@ -21257,7 +21257,7 @@
                 <w:spacing w:val="-2"/>
                 <w:sz w:val="38"/>
               </w:rPr>
-              <w:t>0.0000</w:t>
+              <w:t>{{SCOPE1}}</w:t>
             </w:r>
           </w:p>
           <w:p>
@@ -21361,7 +21361,7 @@
                 <w:spacing w:val="-2"/>
                 <w:sz w:val="38"/>
               </w:rPr>
-              <w:t>0.1999</w:t>
+              <w:t>{{SCOPE2}}</w:t>
             </w:r>
           </w:p>
           <w:p>
@@ -21465,7 +21465,7 @@
                 <w:spacing w:val="-2"/>
                 <w:sz w:val="38"/>
               </w:rPr>
-              <w:t>0.0000</w:t>
+              <w:t>{{SCOPE1}}</w:t>
             </w:r>
           </w:p>
           <w:p>
@@ -21554,7 +21554,7 @@
                 <w:spacing w:val="-2"/>
                 <w:sz w:val="38"/>
               </w:rPr>
-              <w:t>0.1999</w:t>
+              <w:t>{{SCOPE2}}</w:t>
             </w:r>
           </w:p>
           <w:p>
@@ -22574,7 +22574,7 @@
                 <w:spacing w:val="-2"/>
                 <w:sz w:val="38"/>
               </w:rPr>
-              <w:t>0.0000</w:t>
+              <w:t>{{SCOPE1}}</w:t>
             </w:r>
           </w:p>
           <w:p>
@@ -22678,7 +22678,7 @@
                 <w:spacing w:val="-2"/>
                 <w:sz w:val="38"/>
               </w:rPr>
-              <w:t>0.1999</w:t>
+              <w:t>{{SCOPE2}}</w:t>
             </w:r>
           </w:p>
           <w:p>
@@ -22782,7 +22782,7 @@
                 <w:spacing w:val="-2"/>
                 <w:sz w:val="38"/>
               </w:rPr>
-              <w:t>0.0000</w:t>
+              <w:t>{{SCOPE1}}</w:t>
             </w:r>
           </w:p>
           <w:p>
@@ -22871,7 +22871,7 @@
                 <w:spacing w:val="-2"/>
                 <w:sz w:val="38"/>
               </w:rPr>
-              <w:t>0.1999</w:t>
+              <w:t>{{SCOPE2}}</w:t>
             </w:r>
           </w:p>
           <w:p>
@@ -23891,7 +23891,7 @@
                 <w:spacing w:val="-2"/>
                 <w:sz w:val="38"/>
               </w:rPr>
-              <w:t>0.0000</w:t>
+              <w:t>{{SCOPE1}}</w:t>
             </w:r>
           </w:p>
           <w:p>
@@ -23995,7 +23995,7 @@
                 <w:spacing w:val="-2"/>
                 <w:sz w:val="38"/>
               </w:rPr>
-              <w:t>0.1999</w:t>
+              <w:t>{{SCOPE2}}</w:t>
             </w:r>
           </w:p>
           <w:p>
@@ -24099,7 +24099,7 @@
                 <w:spacing w:val="-2"/>
                 <w:sz w:val="38"/>
               </w:rPr>
-              <w:t>0.0000</w:t>
+              <w:t>{{SCOPE1}}</w:t>
             </w:r>
           </w:p>
           <w:p>
@@ -24188,7 +24188,7 @@
                 <w:spacing w:val="-2"/>
                 <w:sz w:val="38"/>
               </w:rPr>
-              <w:t>0.1999</w:t>
+              <w:t>{{SCOPE2}}</w:t>
             </w:r>
           </w:p>
           <w:p>
@@ -25208,7 +25208,7 @@
                 <w:spacing w:val="-2"/>
                 <w:sz w:val="38"/>
               </w:rPr>
-              <w:t>0.0000</w:t>
+              <w:t>{{SCOPE1}}</w:t>
             </w:r>
           </w:p>
           <w:p>
@@ -25312,7 +25312,7 @@
                 <w:spacing w:val="-2"/>
                 <w:sz w:val="38"/>
               </w:rPr>
-              <w:t>0.1999</w:t>
+              <w:t>{{SCOPE2}}</w:t>
             </w:r>
           </w:p>
           <w:p>
@@ -25416,7 +25416,7 @@
                 <w:spacing w:val="-2"/>
                 <w:sz w:val="38"/>
               </w:rPr>
-              <w:t>0.0000</w:t>
+              <w:t>{{SCOPE1}}</w:t>
             </w:r>
           </w:p>
           <w:p>
@@ -25505,7 +25505,7 @@
                 <w:spacing w:val="-2"/>
                 <w:sz w:val="38"/>
               </w:rPr>
-              <w:t>0.1999</w:t>
+              <w:t>{{SCOPE2}}</w:t>
             </w:r>
           </w:p>
           <w:p>
@@ -26525,7 +26525,7 @@
                 <w:spacing w:val="-2"/>
                 <w:sz w:val="38"/>
               </w:rPr>
-              <w:t>0.0000</w:t>
+              <w:t>{{SCOPE1}}</w:t>
             </w:r>
           </w:p>
           <w:p>
@@ -26629,7 +26629,7 @@
                 <w:spacing w:val="-2"/>
                 <w:sz w:val="38"/>
               </w:rPr>
-              <w:t>0.1999</w:t>
+              <w:t>{{SCOPE2}}</w:t>
             </w:r>
           </w:p>
           <w:p>
@@ -26733,7 +26733,7 @@
                 <w:spacing w:val="-2"/>
                 <w:sz w:val="38"/>
               </w:rPr>
-              <w:t>0.0000</w:t>
+              <w:t>{{SCOPE1}}</w:t>
             </w:r>
           </w:p>
           <w:p>
@@ -26822,7 +26822,7 @@
                 <w:spacing w:val="-2"/>
                 <w:sz w:val="38"/>
               </w:rPr>
-              <w:t>0.1999</w:t>
+              <w:t>{{SCOPE2}}</w:t>
             </w:r>
           </w:p>
           <w:p>
@@ -27224,7 +27224,7 @@
                 <w:color w:val="151F34"/>
                 <w:sz w:val="17"/>
               </w:rPr>
-              <w:t>0.1999 </w:t>
+              <w:t>{{SCOPE2}} </w:t>
             </w:r>
             <w:r>
               <w:rPr>
@@ -27863,7 +27863,7 @@
                 <w:spacing w:val="-2"/>
                 <w:sz w:val="38"/>
               </w:rPr>
-              <w:t>0.0000</w:t>
+              <w:t>{{SCOPE1}}</w:t>
             </w:r>
           </w:p>
           <w:p>
@@ -27967,7 +27967,7 @@
                 <w:spacing w:val="-2"/>
                 <w:sz w:val="38"/>
               </w:rPr>
-              <w:t>0.1999</w:t>
+              <w:t>{{SCOPE2}}</w:t>
             </w:r>
           </w:p>
           <w:p>
@@ -28071,7 +28071,7 @@
                 <w:spacing w:val="-2"/>
                 <w:sz w:val="38"/>
               </w:rPr>
-              <w:t>0.0000</w:t>
+              <w:t>{{SCOPE1}}</w:t>
             </w:r>
           </w:p>
           <w:p>
@@ -28160,7 +28160,7 @@
                 <w:spacing w:val="-2"/>
                 <w:sz w:val="38"/>
               </w:rPr>
-              <w:t>0.1999</w:t>
+              <w:t>{{SCOPE2}}</w:t>
             </w:r>
           </w:p>
           <w:p>
@@ -28562,7 +28562,7 @@
                 <w:color w:val="151F34"/>
                 <w:sz w:val="17"/>
               </w:rPr>
-              <w:t>0.1999 </w:t>
+              <w:t>{{SCOPE2}} </w:t>
             </w:r>
             <w:r>
               <w:rPr>
@@ -29201,7 +29201,7 @@
                 <w:spacing w:val="-2"/>
                 <w:sz w:val="38"/>
               </w:rPr>
-              <w:t>0.0000</w:t>
+              <w:t>{{SCOPE1}}</w:t>
             </w:r>
           </w:p>
           <w:p>
@@ -29305,7 +29305,7 @@
                 <w:spacing w:val="-2"/>
                 <w:sz w:val="38"/>
               </w:rPr>
-              <w:t>0.1999</w:t>
+              <w:t>{{SCOPE2}}</w:t>
             </w:r>
           </w:p>
           <w:p>
@@ -29409,7 +29409,7 @@
                 <w:spacing w:val="-2"/>
                 <w:sz w:val="38"/>
               </w:rPr>
-              <w:t>0.0000</w:t>
+              <w:t>{{SCOPE1}}</w:t>
             </w:r>
           </w:p>
           <w:p>
@@ -29498,7 +29498,7 @@
                 <w:spacing w:val="-2"/>
                 <w:sz w:val="38"/>
               </w:rPr>
-              <w:t>0.1999</w:t>
+              <w:t>{{SCOPE2}}</w:t>
             </w:r>
           </w:p>
           <w:p>
@@ -29900,7 +29900,7 @@
                 <w:color w:val="151F34"/>
                 <w:sz w:val="17"/>
               </w:rPr>
-              <w:t>0.1999 </w:t>
+              <w:t>{{SCOPE2}} </w:t>
             </w:r>
             <w:r>
               <w:rPr>
@@ -30539,7 +30539,7 @@
                 <w:spacing w:val="-2"/>
                 <w:sz w:val="38"/>
               </w:rPr>
-              <w:t>0.0000</w:t>
+              <w:t>{{SCOPE1}}</w:t>
             </w:r>
           </w:p>
           <w:p>
@@ -30643,7 +30643,7 @@
                 <w:spacing w:val="-2"/>
                 <w:sz w:val="38"/>
               </w:rPr>
-              <w:t>0.1999</w:t>
+              <w:t>{{SCOPE2}}</w:t>
             </w:r>
           </w:p>
           <w:p>
@@ -30747,7 +30747,7 @@
                 <w:spacing w:val="-2"/>
                 <w:sz w:val="38"/>
               </w:rPr>
-              <w:t>0.0000</w:t>
+              <w:t>{{SCOPE1}}</w:t>
             </w:r>
           </w:p>
           <w:p>
@@ -30836,7 +30836,7 @@
                 <w:spacing w:val="-2"/>
                 <w:sz w:val="38"/>
               </w:rPr>
-              <w:t>0.1999</w:t>
+              <w:t>{{SCOPE2}}</w:t>
             </w:r>
           </w:p>
           <w:p>
@@ -31856,7 +31856,7 @@
                 <w:spacing w:val="-2"/>
                 <w:sz w:val="38"/>
               </w:rPr>
-              <w:t>0.0000</w:t>
+              <w:t>{{SCOPE1}}</w:t>
             </w:r>
           </w:p>
           <w:p>
@@ -31960,7 +31960,7 @@
                 <w:spacing w:val="-2"/>
                 <w:sz w:val="38"/>
               </w:rPr>
-              <w:t>0.1999</w:t>
+              <w:t>{{SCOPE2}}</w:t>
             </w:r>
           </w:p>
           <w:p>
@@ -32064,7 +32064,7 @@
                 <w:spacing w:val="-2"/>
                 <w:sz w:val="38"/>
               </w:rPr>
-              <w:t>0.0000</w:t>
+              <w:t>{{SCOPE1}}</w:t>
             </w:r>
           </w:p>
           <w:p>
@@ -32153,7 +32153,7 @@
                 <w:spacing w:val="-2"/>
                 <w:sz w:val="38"/>
               </w:rPr>
-              <w:t>0.1999</w:t>
+              <w:t>{{SCOPE2}}</w:t>
             </w:r>
           </w:p>
           <w:p>
@@ -32555,7 +32555,7 @@
                 <w:color w:val="151F34"/>
                 <w:sz w:val="17"/>
               </w:rPr>
-              <w:t>0.1999 </w:t>
+              <w:t>{{SCOPE2}} </w:t>
             </w:r>
             <w:r>
               <w:rPr>
@@ -33194,7 +33194,7 @@
                 <w:spacing w:val="-2"/>
                 <w:sz w:val="38"/>
               </w:rPr>
-              <w:t>0.0000</w:t>
+              <w:t>{{SCOPE1}}</w:t>
             </w:r>
           </w:p>
           <w:p>
@@ -33298,7 +33298,7 @@
                 <w:spacing w:val="-2"/>
                 <w:sz w:val="38"/>
               </w:rPr>
-              <w:t>0.1999</w:t>
+              <w:t>{{SCOPE2}}</w:t>
             </w:r>
           </w:p>
           <w:p>
@@ -33402,7 +33402,7 @@
                 <w:spacing w:val="-2"/>
                 <w:sz w:val="38"/>
               </w:rPr>
-              <w:t>0.0000</w:t>
+              <w:t>{{SCOPE1}}</w:t>
             </w:r>
           </w:p>
           <w:p>
@@ -33491,7 +33491,7 @@
                 <w:spacing w:val="-2"/>
                 <w:sz w:val="38"/>
               </w:rPr>
-              <w:t>0.1999</w:t>
+              <w:t>{{SCOPE2}}</w:t>
             </w:r>
           </w:p>
           <w:p>
@@ -34511,7 +34511,7 @@
                 <w:spacing w:val="-2"/>
                 <w:sz w:val="38"/>
               </w:rPr>
-              <w:t>0.0000</w:t>
+              <w:t>{{SCOPE1}}</w:t>
             </w:r>
           </w:p>
           <w:p>
@@ -34615,7 +34615,7 @@
                 <w:spacing w:val="-2"/>
                 <w:sz w:val="38"/>
               </w:rPr>
-              <w:t>0.1999</w:t>
+              <w:t>{{SCOPE2}}</w:t>
             </w:r>
           </w:p>
           <w:p>
@@ -34719,7 +34719,7 @@
                 <w:spacing w:val="-2"/>
                 <w:sz w:val="38"/>
               </w:rPr>
-              <w:t>0.0000</w:t>
+              <w:t>{{SCOPE1}}</w:t>
             </w:r>
           </w:p>
           <w:p>
@@ -34808,7 +34808,7 @@
                 <w:spacing w:val="-2"/>
                 <w:sz w:val="38"/>
               </w:rPr>
-              <w:t>0.1999</w:t>
+              <w:t>{{SCOPE2}}</w:t>
             </w:r>
           </w:p>
           <w:p>
@@ -35828,7 +35828,7 @@
                 <w:spacing w:val="-2"/>
                 <w:sz w:val="38"/>
               </w:rPr>
-              <w:t>0.0000</w:t>
+              <w:t>{{SCOPE1}}</w:t>
             </w:r>
           </w:p>
           <w:p>
@@ -35932,7 +35932,7 @@
                 <w:spacing w:val="-2"/>
                 <w:sz w:val="38"/>
               </w:rPr>
-              <w:t>0.1999</w:t>
+              <w:t>{{SCOPE2}}</w:t>
             </w:r>
           </w:p>
           <w:p>
@@ -36036,7 +36036,7 @@
                 <w:spacing w:val="-2"/>
                 <w:sz w:val="38"/>
               </w:rPr>
-              <w:t>0.0000</w:t>
+              <w:t>{{SCOPE1}}</w:t>
             </w:r>
           </w:p>
           <w:p>
@@ -36125,7 +36125,7 @@
                 <w:spacing w:val="-2"/>
                 <w:sz w:val="38"/>
               </w:rPr>
-              <w:t>0.1999</w:t>
+              <w:t>{{SCOPE2}}</w:t>
             </w:r>
           </w:p>
           <w:p>
@@ -37145,7 +37145,7 @@
                 <w:spacing w:val="-2"/>
                 <w:sz w:val="38"/>
               </w:rPr>
-              <w:t>0.0000</w:t>
+              <w:t>{{SCOPE1}}</w:t>
             </w:r>
           </w:p>
           <w:p>
@@ -37249,7 +37249,7 @@
                 <w:spacing w:val="-2"/>
                 <w:sz w:val="38"/>
               </w:rPr>
-              <w:t>0.1999</w:t>
+              <w:t>{{SCOPE2}}</w:t>
             </w:r>
           </w:p>
           <w:p>
@@ -37353,7 +37353,7 @@
                 <w:spacing w:val="-2"/>
                 <w:sz w:val="38"/>
               </w:rPr>
-              <w:t>0.0000</w:t>
+              <w:t>{{SCOPE1}}</w:t>
             </w:r>
           </w:p>
           <w:p>
@@ -37442,7 +37442,7 @@
                 <w:spacing w:val="-2"/>
                 <w:sz w:val="38"/>
               </w:rPr>
-              <w:t>0.1999</w:t>
+              <w:t>{{SCOPE2}}</w:t>
             </w:r>
           </w:p>
           <w:p>
@@ -38462,7 +38462,7 @@
                 <w:spacing w:val="-2"/>
                 <w:sz w:val="38"/>
               </w:rPr>
-              <w:t>0.0000</w:t>
+              <w:t>{{SCOPE1}}</w:t>
             </w:r>
           </w:p>
           <w:p>
@@ -38566,7 +38566,7 @@
                 <w:spacing w:val="-2"/>
                 <w:sz w:val="38"/>
               </w:rPr>
-              <w:t>0.1999</w:t>
+              <w:t>{{SCOPE2}}</w:t>
             </w:r>
           </w:p>
           <w:p>
@@ -38670,7 +38670,7 @@
                 <w:spacing w:val="-2"/>
                 <w:sz w:val="38"/>
               </w:rPr>
-              <w:t>0.0000</w:t>
+              <w:t>{{SCOPE1}}</w:t>
             </w:r>
           </w:p>
           <w:p>
@@ -38759,7 +38759,7 @@
                 <w:spacing w:val="-2"/>
                 <w:sz w:val="38"/>
               </w:rPr>
-              <w:t>0.1999</w:t>
+              <w:t>{{SCOPE2}}</w:t>
             </w:r>
           </w:p>
           <w:p>
@@ -39779,7 +39779,7 @@
                 <w:spacing w:val="-2"/>
                 <w:sz w:val="38"/>
               </w:rPr>
-              <w:t>0.0000</w:t>
+              <w:t>{{SCOPE1}}</w:t>
             </w:r>
           </w:p>
           <w:p>
@@ -39883,7 +39883,7 @@
                 <w:spacing w:val="-2"/>
                 <w:sz w:val="38"/>
               </w:rPr>
-              <w:t>0.1999</w:t>
+              <w:t>{{SCOPE2}}</w:t>
             </w:r>
           </w:p>
           <w:p>
@@ -39987,7 +39987,7 @@
                 <w:spacing w:val="-2"/>
                 <w:sz w:val="38"/>
               </w:rPr>
-              <w:t>0.0000</w:t>
+              <w:t>{{SCOPE1}}</w:t>
             </w:r>
           </w:p>
           <w:p>
@@ -40076,7 +40076,7 @@
                 <w:spacing w:val="-2"/>
                 <w:sz w:val="38"/>
               </w:rPr>
-              <w:t>0.1999</w:t>
+              <w:t>{{SCOPE2}}</w:t>
             </w:r>
           </w:p>
           <w:p>
@@ -41096,7 +41096,7 @@
                 <w:spacing w:val="-2"/>
                 <w:sz w:val="38"/>
               </w:rPr>
-              <w:t>0.0000</w:t>
+              <w:t>{{SCOPE1}}</w:t>
             </w:r>
           </w:p>
           <w:p>
@@ -41200,7 +41200,7 @@
                 <w:spacing w:val="-2"/>
                 <w:sz w:val="38"/>
               </w:rPr>
-              <w:t>0.1999</w:t>
+              <w:t>{{SCOPE2}}</w:t>
             </w:r>
           </w:p>
           <w:p>
@@ -41304,7 +41304,7 @@
                 <w:spacing w:val="-2"/>
                 <w:sz w:val="38"/>
               </w:rPr>
-              <w:t>0.0000</w:t>
+              <w:t>{{SCOPE1}}</w:t>
             </w:r>
           </w:p>
           <w:p>
@@ -41393,7 +41393,7 @@
                 <w:spacing w:val="-2"/>
                 <w:sz w:val="38"/>
               </w:rPr>
-              <w:t>0.1999</w:t>
+              <w:t>{{SCOPE2}}</w:t>
             </w:r>
           </w:p>
           <w:p>
@@ -42413,7 +42413,7 @@
                 <w:spacing w:val="-2"/>
                 <w:sz w:val="38"/>
               </w:rPr>
-              <w:t>0.0000</w:t>
+              <w:t>{{SCOPE1}}</w:t>
             </w:r>
           </w:p>
           <w:p>
@@ -42517,7 +42517,7 @@
                 <w:spacing w:val="-2"/>
                 <w:sz w:val="38"/>
               </w:rPr>
-              <w:t>0.1999</w:t>
+              <w:t>{{SCOPE2}}</w:t>
             </w:r>
           </w:p>
           <w:p>
@@ -42621,7 +42621,7 @@
                 <w:spacing w:val="-2"/>
                 <w:sz w:val="38"/>
               </w:rPr>
-              <w:t>0.0000</w:t>
+              <w:t>{{SCOPE1}}</w:t>
             </w:r>
           </w:p>
           <w:p>
@@ -42710,7 +42710,7 @@
                 <w:spacing w:val="-2"/>
                 <w:sz w:val="38"/>
               </w:rPr>
-              <w:t>0.1999</w:t>
+              <w:t>{{SCOPE2}}</w:t>
             </w:r>
           </w:p>
           <w:p>
@@ -43730,7 +43730,7 @@
                 <w:spacing w:val="-2"/>
                 <w:sz w:val="38"/>
               </w:rPr>
-              <w:t>0.0000</w:t>
+              <w:t>{{SCOPE1}}</w:t>
             </w:r>
           </w:p>
           <w:p>
@@ -43834,7 +43834,7 @@
                 <w:spacing w:val="-2"/>
                 <w:sz w:val="38"/>
               </w:rPr>
-              <w:t>0.1999</w:t>
+              <w:t>{{SCOPE2}}</w:t>
             </w:r>
           </w:p>
           <w:p>
@@ -43938,7 +43938,7 @@
                 <w:spacing w:val="-2"/>
                 <w:sz w:val="38"/>
               </w:rPr>
-              <w:t>0.0000</w:t>
+              <w:t>{{SCOPE1}}</w:t>
             </w:r>
           </w:p>
           <w:p>
@@ -44027,7 +44027,7 @@
                 <w:spacing w:val="-2"/>
                 <w:sz w:val="38"/>
               </w:rPr>
-              <w:t>0.1999</w:t>
+              <w:t>{{SCOPE2}}</w:t>
             </w:r>
           </w:p>
           <w:p>
@@ -45047,7 +45047,7 @@
                 <w:spacing w:val="-2"/>
                 <w:sz w:val="38"/>
               </w:rPr>
-              <w:t>0.0000</w:t>
+              <w:t>{{SCOPE1}}</w:t>
             </w:r>
           </w:p>
           <w:p>
@@ -45151,7 +45151,7 @@
                 <w:spacing w:val="-2"/>
                 <w:sz w:val="38"/>
               </w:rPr>
-              <w:t>0.1999</w:t>
+              <w:t>{{SCOPE2}}</w:t>
             </w:r>
           </w:p>
           <w:p>
@@ -45255,7 +45255,7 @@
                 <w:spacing w:val="-2"/>
                 <w:sz w:val="38"/>
               </w:rPr>
-              <w:t>0.0000</w:t>
+              <w:t>{{SCOPE1}}</w:t>
             </w:r>
           </w:p>
           <w:p>
@@ -45344,7 +45344,7 @@
                 <w:spacing w:val="-2"/>
                 <w:sz w:val="38"/>
               </w:rPr>
-              <w:t>0.1999</w:t>
+              <w:t>{{SCOPE2}}</w:t>
             </w:r>
           </w:p>
           <w:p>
@@ -46364,7 +46364,7 @@
                 <w:spacing w:val="-2"/>
                 <w:sz w:val="38"/>
               </w:rPr>
-              <w:t>0.0000</w:t>
+              <w:t>{{SCOPE1}}</w:t>
             </w:r>
           </w:p>
           <w:p>
@@ -46468,7 +46468,7 @@
                 <w:spacing w:val="-2"/>
                 <w:sz w:val="38"/>
               </w:rPr>
-              <w:t>0.1999</w:t>
+              <w:t>{{SCOPE2}}</w:t>
             </w:r>
           </w:p>
           <w:p>
@@ -46572,7 +46572,7 @@
                 <w:spacing w:val="-2"/>
                 <w:sz w:val="38"/>
               </w:rPr>
-              <w:t>0.0000</w:t>
+              <w:t>{{SCOPE1}}</w:t>
             </w:r>
           </w:p>
           <w:p>
@@ -46661,7 +46661,7 @@
                 <w:spacing w:val="-2"/>
                 <w:sz w:val="38"/>
               </w:rPr>
-              <w:t>0.1999</w:t>
+              <w:t>{{SCOPE2}}</w:t>
             </w:r>
           </w:p>
           <w:p>
@@ -47681,7 +47681,7 @@
                 <w:spacing w:val="-2"/>
                 <w:sz w:val="38"/>
               </w:rPr>
-              <w:t>0.0000</w:t>
+              <w:t>{{SCOPE1}}</w:t>
             </w:r>
           </w:p>
           <w:p>
@@ -47785,7 +47785,7 @@
                 <w:spacing w:val="-2"/>
                 <w:sz w:val="38"/>
               </w:rPr>
-              <w:t>0.1999</w:t>
+              <w:t>{{SCOPE2}}</w:t>
             </w:r>
           </w:p>
           <w:p>
@@ -47889,7 +47889,7 @@
                 <w:spacing w:val="-2"/>
                 <w:sz w:val="38"/>
               </w:rPr>
-              <w:t>0.0000</w:t>
+              <w:t>{{SCOPE1}}</w:t>
             </w:r>
           </w:p>
           <w:p>
@@ -47978,7 +47978,7 @@
                 <w:spacing w:val="-2"/>
                 <w:sz w:val="38"/>
               </w:rPr>
-              <w:t>0.1999</w:t>
+              <w:t>{{SCOPE2}}</w:t>
             </w:r>
           </w:p>
           <w:p>
@@ -48998,7 +48998,7 @@
                 <w:spacing w:val="-2"/>
                 <w:sz w:val="38"/>
               </w:rPr>
-              <w:t>0.0000</w:t>
+              <w:t>{{SCOPE1}}</w:t>
             </w:r>
           </w:p>
           <w:p>
@@ -49102,7 +49102,7 @@
                 <w:spacing w:val="-2"/>
                 <w:sz w:val="38"/>
               </w:rPr>
-              <w:t>0.1999</w:t>
+              <w:t>{{SCOPE2}}</w:t>
             </w:r>
           </w:p>
           <w:p>
@@ -49206,7 +49206,7 @@
                 <w:spacing w:val="-2"/>
                 <w:sz w:val="38"/>
               </w:rPr>
-              <w:t>0.0000</w:t>
+              <w:t>{{SCOPE1}}</w:t>
             </w:r>
           </w:p>
           <w:p>
@@ -49295,7 +49295,7 @@
                 <w:spacing w:val="-2"/>
                 <w:sz w:val="38"/>
               </w:rPr>
-              <w:t>0.1999</w:t>
+              <w:t>{{SCOPE2}}</w:t>
             </w:r>
           </w:p>
           <w:p>
@@ -50315,7 +50315,7 @@
                 <w:spacing w:val="-2"/>
                 <w:sz w:val="38"/>
               </w:rPr>
-              <w:t>0.0000</w:t>
+              <w:t>{{SCOPE1}}</w:t>
             </w:r>
           </w:p>
           <w:p>
@@ -50419,7 +50419,7 @@
                 <w:spacing w:val="-2"/>
                 <w:sz w:val="38"/>
               </w:rPr>
-              <w:t>0.1999</w:t>
+              <w:t>{{SCOPE2}}</w:t>
             </w:r>
           </w:p>
           <w:p>
@@ -50523,7 +50523,7 @@
                 <w:spacing w:val="-2"/>
                 <w:sz w:val="38"/>
               </w:rPr>
-              <w:t>0.0000</w:t>
+              <w:t>{{SCOPE1}}</w:t>
             </w:r>
           </w:p>
           <w:p>
@@ -50612,7 +50612,7 @@
                 <w:spacing w:val="-2"/>
                 <w:sz w:val="38"/>
               </w:rPr>
-              <w:t>0.1999</w:t>
+              <w:t>{{SCOPE2}}</w:t>
             </w:r>
           </w:p>
           <w:p>
@@ -51632,7 +51632,7 @@
                 <w:spacing w:val="-2"/>
                 <w:sz w:val="38"/>
               </w:rPr>
-              <w:t>0.0000</w:t>
+              <w:t>{{SCOPE1}}</w:t>
             </w:r>
           </w:p>
           <w:p>
@@ -51736,7 +51736,7 @@
                 <w:spacing w:val="-2"/>
                 <w:sz w:val="38"/>
               </w:rPr>
-              <w:t>0.1999</w:t>
+              <w:t>{{SCOPE2}}</w:t>
             </w:r>
           </w:p>
           <w:p>
@@ -51840,7 +51840,7 @@
                 <w:spacing w:val="-2"/>
                 <w:sz w:val="38"/>
               </w:rPr>
-              <w:t>0.0000</w:t>
+              <w:t>{{SCOPE1}}</w:t>
             </w:r>
           </w:p>
           <w:p>
@@ -51929,7 +51929,7 @@
                 <w:spacing w:val="-2"/>
                 <w:sz w:val="38"/>
               </w:rPr>
-              <w:t>0.1999</w:t>
+              <w:t>{{SCOPE2}}</w:t>
             </w:r>
           </w:p>
           <w:p>
@@ -52949,7 +52949,7 @@
                 <w:spacing w:val="-2"/>
                 <w:sz w:val="38"/>
               </w:rPr>
-              <w:t>0.0000</w:t>
+              <w:t>{{SCOPE1}}</w:t>
             </w:r>
           </w:p>
           <w:p>
@@ -53053,7 +53053,7 @@
                 <w:spacing w:val="-2"/>
                 <w:sz w:val="38"/>
               </w:rPr>
-              <w:t>0.1999</w:t>
+              <w:t>{{SCOPE2}}</w:t>
             </w:r>
           </w:p>
           <w:p>
@@ -53157,7 +53157,7 @@
                 <w:spacing w:val="-2"/>
                 <w:sz w:val="38"/>
               </w:rPr>
-              <w:t>0.0000</w:t>
+              <w:t>{{SCOPE1}}</w:t>
             </w:r>
           </w:p>
           <w:p>
@@ -53246,7 +53246,7 @@
                 <w:spacing w:val="-2"/>
                 <w:sz w:val="38"/>
               </w:rPr>
-              <w:t>0.1999</w:t>
+              <w:t>{{SCOPE2}}</w:t>
             </w:r>
           </w:p>
           <w:p>
@@ -54266,7 +54266,7 @@
                 <w:spacing w:val="-2"/>
                 <w:sz w:val="38"/>
               </w:rPr>
-              <w:t>0.0000</w:t>
+              <w:t>{{SCOPE1}}</w:t>
             </w:r>
           </w:p>
           <w:p>
@@ -54370,7 +54370,7 @@
                 <w:spacing w:val="-2"/>
                 <w:sz w:val="38"/>
               </w:rPr>
-              <w:t>0.1999</w:t>
+              <w:t>{{SCOPE2}}</w:t>
             </w:r>
           </w:p>
           <w:p>
@@ -54474,7 +54474,7 @@
                 <w:spacing w:val="-2"/>
                 <w:sz w:val="38"/>
               </w:rPr>
-              <w:t>0.0000</w:t>
+              <w:t>{{SCOPE1}}</w:t>
             </w:r>
           </w:p>
           <w:p>
@@ -54563,7 +54563,7 @@
                 <w:spacing w:val="-2"/>
                 <w:sz w:val="38"/>
               </w:rPr>
-              <w:t>0.1999</w:t>
+              <w:t>{{SCOPE2}}</w:t>
             </w:r>
           </w:p>
           <w:p>
@@ -55583,7 +55583,7 @@
                 <w:spacing w:val="-2"/>
                 <w:sz w:val="38"/>
               </w:rPr>
-              <w:t>0.0000</w:t>
+              <w:t>{{SCOPE1}}</w:t>
             </w:r>
           </w:p>
           <w:p>
@@ -55687,7 +55687,7 @@
                 <w:spacing w:val="-2"/>
                 <w:sz w:val="38"/>
               </w:rPr>
-              <w:t>0.1999</w:t>
+              <w:t>{{SCOPE2}}</w:t>
             </w:r>
           </w:p>
           <w:p>
@@ -55791,7 +55791,7 @@
                 <w:spacing w:val="-2"/>
                 <w:sz w:val="38"/>
               </w:rPr>
-              <w:t>0.0000</w:t>
+              <w:t>{{SCOPE1}}</w:t>
             </w:r>
           </w:p>
           <w:p>
@@ -55880,7 +55880,7 @@
                 <w:spacing w:val="-2"/>
                 <w:sz w:val="38"/>
               </w:rPr>
-              <w:t>0.1999</w:t>
+              <w:t>{{SCOPE2}}</w:t>
             </w:r>
           </w:p>
           <w:p>
@@ -56900,7 +56900,7 @@
                 <w:spacing w:val="-2"/>
                 <w:sz w:val="38"/>
               </w:rPr>
-              <w:t>0.0000</w:t>
+              <w:t>{{SCOPE1}}</w:t>
             </w:r>
           </w:p>
           <w:p>
@@ -57004,7 +57004,7 @@
                 <w:spacing w:val="-2"/>
                 <w:sz w:val="38"/>
               </w:rPr>
-              <w:t>0.1999</w:t>
+              <w:t>{{SCOPE2}}</w:t>
             </w:r>
           </w:p>
           <w:p>
@@ -57108,7 +57108,7 @@
                 <w:spacing w:val="-2"/>
                 <w:sz w:val="38"/>
               </w:rPr>
-              <w:t>0.0000</w:t>
+              <w:t>{{SCOPE1}}</w:t>
             </w:r>
           </w:p>
           <w:p>
@@ -57197,7 +57197,7 @@
                 <w:spacing w:val="-2"/>
                 <w:sz w:val="38"/>
               </w:rPr>
-              <w:t>0.1999</w:t>
+              <w:t>{{SCOPE2}}</w:t>
             </w:r>
           </w:p>
           <w:p>
@@ -58217,7 +58217,7 @@
                 <w:spacing w:val="-2"/>
                 <w:sz w:val="38"/>
               </w:rPr>
-              <w:t>0.0000</w:t>
+              <w:t>{{SCOPE1}}</w:t>
             </w:r>
           </w:p>
           <w:p>
@@ -58321,7 +58321,7 @@
                 <w:spacing w:val="-2"/>
                 <w:sz w:val="38"/>
               </w:rPr>
-              <w:t>0.1999</w:t>
+              <w:t>{{SCOPE2}}</w:t>
             </w:r>
           </w:p>
           <w:p>
@@ -58425,7 +58425,7 @@
                 <w:spacing w:val="-2"/>
                 <w:sz w:val="38"/>
               </w:rPr>
-              <w:t>0.0000</w:t>
+              <w:t>{{SCOPE1}}</w:t>
             </w:r>
           </w:p>
           <w:p>
@@ -58514,7 +58514,7 @@
                 <w:spacing w:val="-2"/>
                 <w:sz w:val="38"/>
               </w:rPr>
-              <w:t>0.1999</w:t>
+              <w:t>{{SCOPE2}}</w:t>
             </w:r>
           </w:p>
           <w:p>
@@ -59534,7 +59534,7 @@
                 <w:spacing w:val="-2"/>
                 <w:sz w:val="38"/>
               </w:rPr>
-              <w:t>0.0000</w:t>
+              <w:t>{{SCOPE1}}</w:t>
             </w:r>
           </w:p>
           <w:p>
@@ -59638,7 +59638,7 @@
                 <w:spacing w:val="-2"/>
                 <w:sz w:val="38"/>
               </w:rPr>
-              <w:t>0.1999</w:t>
+              <w:t>{{SCOPE2}}</w:t>
             </w:r>
           </w:p>
           <w:p>
@@ -59742,7 +59742,7 @@
                 <w:spacing w:val="-2"/>
                 <w:sz w:val="38"/>
               </w:rPr>
-              <w:t>0.0000</w:t>
+              <w:t>{{SCOPE1}}</w:t>
             </w:r>
           </w:p>
           <w:p>
@@ -59831,7 +59831,7 @@
                 <w:spacing w:val="-2"/>
                 <w:sz w:val="38"/>
               </w:rPr>
-              <w:t>0.1999</w:t>
+              <w:t>{{SCOPE2}}</w:t>
             </w:r>
           </w:p>
           <w:p>
@@ -60851,7 +60851,7 @@
                 <w:spacing w:val="-2"/>
                 <w:sz w:val="38"/>
               </w:rPr>
-              <w:t>0.0000</w:t>
+              <w:t>{{SCOPE1}}</w:t>
             </w:r>
           </w:p>
           <w:p>
@@ -60955,7 +60955,7 @@
                 <w:spacing w:val="-2"/>
                 <w:sz w:val="38"/>
               </w:rPr>
-              <w:t>0.1999</w:t>
+              <w:t>{{SCOPE2}}</w:t>
             </w:r>
           </w:p>
           <w:p>
@@ -61059,7 +61059,7 @@
                 <w:spacing w:val="-2"/>
                 <w:sz w:val="38"/>
               </w:rPr>
-              <w:t>0.0000</w:t>
+              <w:t>{{SCOPE1}}</w:t>
             </w:r>
           </w:p>
           <w:p>
@@ -61148,7 +61148,7 @@
                 <w:spacing w:val="-2"/>
                 <w:sz w:val="38"/>
               </w:rPr>
-              <w:t>0.1999</w:t>
+              <w:t>{{SCOPE2}}</w:t>
             </w:r>
           </w:p>
           <w:p>
@@ -62168,7 +62168,7 @@
                 <w:spacing w:val="-2"/>
                 <w:sz w:val="38"/>
               </w:rPr>
-              <w:t>0.0000</w:t>
+              <w:t>{{SCOPE1}}</w:t>
             </w:r>
           </w:p>
           <w:p>
@@ -62272,7 +62272,7 @@
                 <w:spacing w:val="-2"/>
                 <w:sz w:val="38"/>
               </w:rPr>
-              <w:t>0.1999</w:t>
+              <w:t>{{SCOPE2}}</w:t>
             </w:r>
           </w:p>
           <w:p>
@@ -62376,7 +62376,7 @@
                 <w:spacing w:val="-2"/>
                 <w:sz w:val="38"/>
               </w:rPr>
-              <w:t>0.0000</w:t>
+              <w:t>{{SCOPE1}}</w:t>
             </w:r>
           </w:p>
           <w:p>
@@ -62465,7 +62465,7 @@
                 <w:spacing w:val="-2"/>
                 <w:sz w:val="38"/>
               </w:rPr>
-              <w:t>0.1999</w:t>
+              <w:t>{{SCOPE2}}</w:t>
             </w:r>
           </w:p>
           <w:p>
@@ -63616,7 +63616,7 @@
                 <w:spacing w:val="-2"/>
                 <w:sz w:val="38"/>
               </w:rPr>
-              <w:t>0.0000</w:t>
+              <w:t>{{SCOPE1}}</w:t>
             </w:r>
           </w:p>
           <w:p>
@@ -63720,7 +63720,7 @@
                 <w:spacing w:val="-2"/>
                 <w:sz w:val="38"/>
               </w:rPr>
-              <w:t>0.1999</w:t>
+              <w:t>{{SCOPE2}}</w:t>
             </w:r>
           </w:p>
           <w:p>
@@ -63824,7 +63824,7 @@
                 <w:spacing w:val="-2"/>
                 <w:sz w:val="38"/>
               </w:rPr>
-              <w:t>0.0000</w:t>
+              <w:t>{{SCOPE1}}</w:t>
             </w:r>
           </w:p>
           <w:p>
@@ -63913,7 +63913,7 @@
                 <w:spacing w:val="-2"/>
                 <w:sz w:val="38"/>
               </w:rPr>
-              <w:t>0.1999</w:t>
+              <w:t>{{SCOPE2}}</w:t>
             </w:r>
           </w:p>
           <w:p>

</xml_diff>

<commit_message>
Update UK template to professional docxtemplater compatible version
</commit_message>
<xml_diff>
--- a/src/services/reports/uk/template.docx
+++ b/src/services/reports/uk/template.docx
@@ -1361,7 +1361,7 @@
                 <w:spacing w:val="-2"/>
                 <w:sz w:val="38"/>
               </w:rPr>
-              <w:t>{{SCOPE1}}</w:t>
+              <w:t>0.0000</w:t>
             </w:r>
           </w:p>
           <w:p>
@@ -1465,7 +1465,7 @@
                 <w:spacing w:val="-2"/>
                 <w:sz w:val="38"/>
               </w:rPr>
-              <w:t>{{SCOPE2}}</w:t>
+              <w:t>0.1999</w:t>
             </w:r>
           </w:p>
           <w:p>
@@ -1569,7 +1569,7 @@
                 <w:spacing w:val="-2"/>
                 <w:sz w:val="38"/>
               </w:rPr>
-              <w:t>{{SCOPE1}}</w:t>
+              <w:t>0.0000</w:t>
             </w:r>
           </w:p>
           <w:p>
@@ -1658,7 +1658,7 @@
                 <w:spacing w:val="-2"/>
                 <w:sz w:val="38"/>
               </w:rPr>
-              <w:t>{{SCOPE2}}</w:t>
+              <w:t>0.1999</w:t>
             </w:r>
           </w:p>
           <w:p>
@@ -2678,7 +2678,7 @@
                 <w:spacing w:val="-2"/>
                 <w:sz w:val="38"/>
               </w:rPr>
-              <w:t>{{SCOPE1}}</w:t>
+              <w:t>0.0000</w:t>
             </w:r>
           </w:p>
           <w:p>
@@ -2782,7 +2782,7 @@
                 <w:spacing w:val="-2"/>
                 <w:sz w:val="38"/>
               </w:rPr>
-              <w:t>{{SCOPE2}}</w:t>
+              <w:t>0.1999</w:t>
             </w:r>
           </w:p>
           <w:p>
@@ -2886,7 +2886,7 @@
                 <w:spacing w:val="-2"/>
                 <w:sz w:val="38"/>
               </w:rPr>
-              <w:t>{{SCOPE1}}</w:t>
+              <w:t>0.0000</w:t>
             </w:r>
           </w:p>
           <w:p>
@@ -2975,7 +2975,7 @@
                 <w:spacing w:val="-2"/>
                 <w:sz w:val="38"/>
               </w:rPr>
-              <w:t>{{SCOPE2}}</w:t>
+              <w:t>0.1999</w:t>
             </w:r>
           </w:p>
           <w:p>
@@ -3196,7 +3196,7 @@
                 <w:color w:val="151F34"/>
                 <w:sz w:val="17"/>
               </w:rPr>
-              <w:t>{{SCOPE1}} </w:t>
+              <w:t>0.0000 </w:t>
             </w:r>
             <w:r>
               <w:rPr>
@@ -3287,7 +3287,7 @@
                 <w:color w:val="151F34"/>
                 <w:sz w:val="17"/>
               </w:rPr>
-              <w:t>{{SCOPE2}} </w:t>
+              <w:t>0.1999 </w:t>
             </w:r>
             <w:r>
               <w:rPr>
@@ -3377,7 +3377,7 @@
                 <w:color w:val="151F34"/>
                 <w:sz w:val="17"/>
               </w:rPr>
-              <w:t>{{SCOPE1}} </w:t>
+              <w:t>0.0000 </w:t>
             </w:r>
             <w:r>
               <w:rPr>
@@ -3461,7 +3461,7 @@
                 <w:color w:val="151F34"/>
                 <w:sz w:val="17"/>
               </w:rPr>
-              <w:t>{{SCOPE2}} </w:t>
+              <w:t>0.1999 </w:t>
             </w:r>
             <w:r>
               <w:rPr>
@@ -4016,7 +4016,7 @@
                 <w:spacing w:val="-2"/>
                 <w:sz w:val="38"/>
               </w:rPr>
-              <w:t>{{SCOPE1}}</w:t>
+              <w:t>0.0000</w:t>
             </w:r>
           </w:p>
           <w:p>
@@ -4120,7 +4120,7 @@
                 <w:spacing w:val="-2"/>
                 <w:sz w:val="38"/>
               </w:rPr>
-              <w:t>{{SCOPE2}}</w:t>
+              <w:t>0.1999</w:t>
             </w:r>
           </w:p>
           <w:p>
@@ -4224,7 +4224,7 @@
                 <w:spacing w:val="-2"/>
                 <w:sz w:val="38"/>
               </w:rPr>
-              <w:t>{{SCOPE1}}</w:t>
+              <w:t>0.0000</w:t>
             </w:r>
           </w:p>
           <w:p>
@@ -4313,7 +4313,7 @@
                 <w:spacing w:val="-2"/>
                 <w:sz w:val="38"/>
               </w:rPr>
-              <w:t>{{SCOPE2}}</w:t>
+              <w:t>0.1999</w:t>
             </w:r>
           </w:p>
           <w:p>
@@ -5425,7 +5425,7 @@
                 <w:spacing w:val="-2"/>
                 <w:sz w:val="38"/>
               </w:rPr>
-              <w:t>{{SCOPE1}}</w:t>
+              <w:t>0.0000</w:t>
             </w:r>
           </w:p>
           <w:p>
@@ -5529,7 +5529,7 @@
                 <w:spacing w:val="-2"/>
                 <w:sz w:val="38"/>
               </w:rPr>
-              <w:t>{{SCOPE2}}</w:t>
+              <w:t>0.1999</w:t>
             </w:r>
           </w:p>
           <w:p>
@@ -5633,7 +5633,7 @@
                 <w:spacing w:val="-2"/>
                 <w:sz w:val="38"/>
               </w:rPr>
-              <w:t>{{SCOPE1}}</w:t>
+              <w:t>0.0000</w:t>
             </w:r>
           </w:p>
           <w:p>
@@ -5722,7 +5722,7 @@
                 <w:spacing w:val="-2"/>
                 <w:sz w:val="38"/>
               </w:rPr>
-              <w:t>{{SCOPE2}}</w:t>
+              <w:t>0.1999</w:t>
             </w:r>
           </w:p>
           <w:p>
@@ -6742,7 +6742,7 @@
                 <w:spacing w:val="-2"/>
                 <w:sz w:val="38"/>
               </w:rPr>
-              <w:t>{{SCOPE1}}</w:t>
+              <w:t>0.0000</w:t>
             </w:r>
           </w:p>
           <w:p>
@@ -6846,7 +6846,7 @@
                 <w:spacing w:val="-2"/>
                 <w:sz w:val="38"/>
               </w:rPr>
-              <w:t>{{SCOPE2}}</w:t>
+              <w:t>0.1999</w:t>
             </w:r>
           </w:p>
           <w:p>
@@ -6950,7 +6950,7 @@
                 <w:spacing w:val="-2"/>
                 <w:sz w:val="38"/>
               </w:rPr>
-              <w:t>{{SCOPE1}}</w:t>
+              <w:t>0.0000</w:t>
             </w:r>
           </w:p>
           <w:p>
@@ -7039,7 +7039,7 @@
                 <w:spacing w:val="-2"/>
                 <w:sz w:val="38"/>
               </w:rPr>
-              <w:t>{{SCOPE2}}</w:t>
+              <w:t>0.1999</w:t>
             </w:r>
           </w:p>
           <w:p>
@@ -8059,7 +8059,7 @@
                 <w:spacing w:val="-2"/>
                 <w:sz w:val="38"/>
               </w:rPr>
-              <w:t>{{SCOPE1}}</w:t>
+              <w:t>0.0000</w:t>
             </w:r>
           </w:p>
           <w:p>
@@ -8163,7 +8163,7 @@
                 <w:spacing w:val="-2"/>
                 <w:sz w:val="38"/>
               </w:rPr>
-              <w:t>{{SCOPE2}}</w:t>
+              <w:t>0.1999</w:t>
             </w:r>
           </w:p>
           <w:p>
@@ -8267,7 +8267,7 @@
                 <w:spacing w:val="-2"/>
                 <w:sz w:val="38"/>
               </w:rPr>
-              <w:t>{{SCOPE1}}</w:t>
+              <w:t>0.0000</w:t>
             </w:r>
           </w:p>
           <w:p>
@@ -8356,7 +8356,7 @@
                 <w:spacing w:val="-2"/>
                 <w:sz w:val="38"/>
               </w:rPr>
-              <w:t>{{SCOPE2}}</w:t>
+              <w:t>0.1999</w:t>
             </w:r>
           </w:p>
           <w:p>
@@ -9376,7 +9376,7 @@
                 <w:spacing w:val="-2"/>
                 <w:sz w:val="38"/>
               </w:rPr>
-              <w:t>{{SCOPE1}}</w:t>
+              <w:t>0.0000</w:t>
             </w:r>
           </w:p>
           <w:p>
@@ -9480,7 +9480,7 @@
                 <w:spacing w:val="-2"/>
                 <w:sz w:val="38"/>
               </w:rPr>
-              <w:t>{{SCOPE2}}</w:t>
+              <w:t>0.1999</w:t>
             </w:r>
           </w:p>
           <w:p>
@@ -9584,7 +9584,7 @@
                 <w:spacing w:val="-2"/>
                 <w:sz w:val="38"/>
               </w:rPr>
-              <w:t>{{SCOPE1}}</w:t>
+              <w:t>0.0000</w:t>
             </w:r>
           </w:p>
           <w:p>
@@ -9673,7 +9673,7 @@
                 <w:spacing w:val="-2"/>
                 <w:sz w:val="38"/>
               </w:rPr>
-              <w:t>{{SCOPE2}}</w:t>
+              <w:t>0.1999</w:t>
             </w:r>
           </w:p>
           <w:p>
@@ -9985,7 +9985,7 @@
                 <w:color w:val="151F34"/>
                 <w:sz w:val="17"/>
               </w:rPr>
-              <w:t>{{SCOPE1}} </w:t>
+              <w:t>0.0000 </w:t>
             </w:r>
             <w:r>
               <w:rPr>
@@ -10075,7 +10075,7 @@
                 <w:color w:val="151F34"/>
                 <w:sz w:val="17"/>
               </w:rPr>
-              <w:t>{{SCOPE2}} </w:t>
+              <w:t>0.1999 </w:t>
             </w:r>
             <w:r>
               <w:rPr>
@@ -10166,7 +10166,7 @@
                 <w:color w:val="151F34"/>
                 <w:sz w:val="17"/>
               </w:rPr>
-              <w:t>{{SCOPE2}} tCO2e / </w:t>
+              <w:t>0.1999 tCO2e / </w:t>
             </w:r>
             <w:r>
               <w:rPr>
@@ -10721,7 +10721,7 @@
                 <w:spacing w:val="-2"/>
                 <w:sz w:val="38"/>
               </w:rPr>
-              <w:t>{{SCOPE1}}</w:t>
+              <w:t>0.0000</w:t>
             </w:r>
           </w:p>
           <w:p>
@@ -10825,7 +10825,7 @@
                 <w:spacing w:val="-2"/>
                 <w:sz w:val="38"/>
               </w:rPr>
-              <w:t>{{SCOPE2}}</w:t>
+              <w:t>0.1999</w:t>
             </w:r>
           </w:p>
           <w:p>
@@ -10929,7 +10929,7 @@
                 <w:spacing w:val="-2"/>
                 <w:sz w:val="38"/>
               </w:rPr>
-              <w:t>{{SCOPE1}}</w:t>
+              <w:t>0.0000</w:t>
             </w:r>
           </w:p>
           <w:p>
@@ -11018,7 +11018,7 @@
                 <w:spacing w:val="-2"/>
                 <w:sz w:val="38"/>
               </w:rPr>
-              <w:t>{{SCOPE2}}</w:t>
+              <w:t>0.1999</w:t>
             </w:r>
           </w:p>
           <w:p>
@@ -12038,7 +12038,7 @@
                 <w:spacing w:val="-2"/>
                 <w:sz w:val="38"/>
               </w:rPr>
-              <w:t>{{SCOPE1}}</w:t>
+              <w:t>0.0000</w:t>
             </w:r>
           </w:p>
           <w:p>
@@ -12142,7 +12142,7 @@
                 <w:spacing w:val="-2"/>
                 <w:sz w:val="38"/>
               </w:rPr>
-              <w:t>{{SCOPE2}}</w:t>
+              <w:t>0.1999</w:t>
             </w:r>
           </w:p>
           <w:p>
@@ -12246,7 +12246,7 @@
                 <w:spacing w:val="-2"/>
                 <w:sz w:val="38"/>
               </w:rPr>
-              <w:t>{{SCOPE1}}</w:t>
+              <w:t>0.0000</w:t>
             </w:r>
           </w:p>
           <w:p>
@@ -12335,7 +12335,7 @@
                 <w:spacing w:val="-2"/>
                 <w:sz w:val="38"/>
               </w:rPr>
-              <w:t>{{SCOPE2}}</w:t>
+              <w:t>0.1999</w:t>
             </w:r>
           </w:p>
           <w:p>
@@ -13355,7 +13355,7 @@
                 <w:spacing w:val="-2"/>
                 <w:sz w:val="38"/>
               </w:rPr>
-              <w:t>{{SCOPE1}}</w:t>
+              <w:t>0.0000</w:t>
             </w:r>
           </w:p>
           <w:p>
@@ -13459,7 +13459,7 @@
                 <w:spacing w:val="-2"/>
                 <w:sz w:val="38"/>
               </w:rPr>
-              <w:t>{{SCOPE2}}</w:t>
+              <w:t>0.1999</w:t>
             </w:r>
           </w:p>
           <w:p>
@@ -13563,7 +13563,7 @@
                 <w:spacing w:val="-2"/>
                 <w:sz w:val="38"/>
               </w:rPr>
-              <w:t>{{SCOPE1}}</w:t>
+              <w:t>0.0000</w:t>
             </w:r>
           </w:p>
           <w:p>
@@ -13652,7 +13652,7 @@
                 <w:spacing w:val="-2"/>
                 <w:sz w:val="38"/>
               </w:rPr>
-              <w:t>{{SCOPE2}}</w:t>
+              <w:t>0.1999</w:t>
             </w:r>
           </w:p>
           <w:p>
@@ -14672,7 +14672,7 @@
                 <w:spacing w:val="-2"/>
                 <w:sz w:val="38"/>
               </w:rPr>
-              <w:t>{{SCOPE1}}</w:t>
+              <w:t>0.0000</w:t>
             </w:r>
           </w:p>
           <w:p>
@@ -14776,7 +14776,7 @@
                 <w:spacing w:val="-2"/>
                 <w:sz w:val="38"/>
               </w:rPr>
-              <w:t>{{SCOPE2}}</w:t>
+              <w:t>0.1999</w:t>
             </w:r>
           </w:p>
           <w:p>
@@ -14880,7 +14880,7 @@
                 <w:spacing w:val="-2"/>
                 <w:sz w:val="38"/>
               </w:rPr>
-              <w:t>{{SCOPE1}}</w:t>
+              <w:t>0.0000</w:t>
             </w:r>
           </w:p>
           <w:p>
@@ -14969,7 +14969,7 @@
                 <w:spacing w:val="-2"/>
                 <w:sz w:val="38"/>
               </w:rPr>
-              <w:t>{{SCOPE2}}</w:t>
+              <w:t>0.1999</w:t>
             </w:r>
           </w:p>
           <w:p>
@@ -15989,7 +15989,7 @@
                 <w:spacing w:val="-2"/>
                 <w:sz w:val="38"/>
               </w:rPr>
-              <w:t>{{SCOPE1}}</w:t>
+              <w:t>0.0000</w:t>
             </w:r>
           </w:p>
           <w:p>
@@ -16093,7 +16093,7 @@
                 <w:spacing w:val="-2"/>
                 <w:sz w:val="38"/>
               </w:rPr>
-              <w:t>{{SCOPE2}}</w:t>
+              <w:t>0.1999</w:t>
             </w:r>
           </w:p>
           <w:p>
@@ -16197,7 +16197,7 @@
                 <w:spacing w:val="-2"/>
                 <w:sz w:val="38"/>
               </w:rPr>
-              <w:t>{{SCOPE1}}</w:t>
+              <w:t>0.0000</w:t>
             </w:r>
           </w:p>
           <w:p>
@@ -16286,7 +16286,7 @@
                 <w:spacing w:val="-2"/>
                 <w:sz w:val="38"/>
               </w:rPr>
-              <w:t>{{SCOPE2}}</w:t>
+              <w:t>0.1999</w:t>
             </w:r>
           </w:p>
           <w:p>
@@ -17306,7 +17306,7 @@
                 <w:spacing w:val="-2"/>
                 <w:sz w:val="38"/>
               </w:rPr>
-              <w:t>{{SCOPE1}}</w:t>
+              <w:t>0.0000</w:t>
             </w:r>
           </w:p>
           <w:p>
@@ -17410,7 +17410,7 @@
                 <w:spacing w:val="-2"/>
                 <w:sz w:val="38"/>
               </w:rPr>
-              <w:t>{{SCOPE2}}</w:t>
+              <w:t>0.1999</w:t>
             </w:r>
           </w:p>
           <w:p>
@@ -17514,7 +17514,7 @@
                 <w:spacing w:val="-2"/>
                 <w:sz w:val="38"/>
               </w:rPr>
-              <w:t>{{SCOPE1}}</w:t>
+              <w:t>0.0000</w:t>
             </w:r>
           </w:p>
           <w:p>
@@ -17603,7 +17603,7 @@
                 <w:spacing w:val="-2"/>
                 <w:sz w:val="38"/>
               </w:rPr>
-              <w:t>{{SCOPE2}}</w:t>
+              <w:t>0.1999</w:t>
             </w:r>
           </w:p>
           <w:p>
@@ -18623,7 +18623,7 @@
                 <w:spacing w:val="-2"/>
                 <w:sz w:val="38"/>
               </w:rPr>
-              <w:t>{{SCOPE1}}</w:t>
+              <w:t>0.0000</w:t>
             </w:r>
           </w:p>
           <w:p>
@@ -18727,7 +18727,7 @@
                 <w:spacing w:val="-2"/>
                 <w:sz w:val="38"/>
               </w:rPr>
-              <w:t>{{SCOPE2}}</w:t>
+              <w:t>0.1999</w:t>
             </w:r>
           </w:p>
           <w:p>
@@ -18831,7 +18831,7 @@
                 <w:spacing w:val="-2"/>
                 <w:sz w:val="38"/>
               </w:rPr>
-              <w:t>{{SCOPE1}}</w:t>
+              <w:t>0.0000</w:t>
             </w:r>
           </w:p>
           <w:p>
@@ -18920,7 +18920,7 @@
                 <w:spacing w:val="-2"/>
                 <w:sz w:val="38"/>
               </w:rPr>
-              <w:t>{{SCOPE2}}</w:t>
+              <w:t>0.1999</w:t>
             </w:r>
           </w:p>
           <w:p>
@@ -19940,7 +19940,7 @@
                 <w:spacing w:val="-2"/>
                 <w:sz w:val="38"/>
               </w:rPr>
-              <w:t>{{SCOPE1}}</w:t>
+              <w:t>0.0000</w:t>
             </w:r>
           </w:p>
           <w:p>
@@ -20044,7 +20044,7 @@
                 <w:spacing w:val="-2"/>
                 <w:sz w:val="38"/>
               </w:rPr>
-              <w:t>{{SCOPE2}}</w:t>
+              <w:t>0.1999</w:t>
             </w:r>
           </w:p>
           <w:p>
@@ -20148,7 +20148,7 @@
                 <w:spacing w:val="-2"/>
                 <w:sz w:val="38"/>
               </w:rPr>
-              <w:t>{{SCOPE1}}</w:t>
+              <w:t>0.0000</w:t>
             </w:r>
           </w:p>
           <w:p>
@@ -20237,7 +20237,7 @@
                 <w:spacing w:val="-2"/>
                 <w:sz w:val="38"/>
               </w:rPr>
-              <w:t>{{SCOPE2}}</w:t>
+              <w:t>0.1999</w:t>
             </w:r>
           </w:p>
           <w:p>
@@ -21257,7 +21257,7 @@
                 <w:spacing w:val="-2"/>
                 <w:sz w:val="38"/>
               </w:rPr>
-              <w:t>{{SCOPE1}}</w:t>
+              <w:t>0.0000</w:t>
             </w:r>
           </w:p>
           <w:p>
@@ -21361,7 +21361,7 @@
                 <w:spacing w:val="-2"/>
                 <w:sz w:val="38"/>
               </w:rPr>
-              <w:t>{{SCOPE2}}</w:t>
+              <w:t>0.1999</w:t>
             </w:r>
           </w:p>
           <w:p>
@@ -21465,7 +21465,7 @@
                 <w:spacing w:val="-2"/>
                 <w:sz w:val="38"/>
               </w:rPr>
-              <w:t>{{SCOPE1}}</w:t>
+              <w:t>0.0000</w:t>
             </w:r>
           </w:p>
           <w:p>
@@ -21554,7 +21554,7 @@
                 <w:spacing w:val="-2"/>
                 <w:sz w:val="38"/>
               </w:rPr>
-              <w:t>{{SCOPE2}}</w:t>
+              <w:t>0.1999</w:t>
             </w:r>
           </w:p>
           <w:p>
@@ -22574,7 +22574,7 @@
                 <w:spacing w:val="-2"/>
                 <w:sz w:val="38"/>
               </w:rPr>
-              <w:t>{{SCOPE1}}</w:t>
+              <w:t>0.0000</w:t>
             </w:r>
           </w:p>
           <w:p>
@@ -22678,7 +22678,7 @@
                 <w:spacing w:val="-2"/>
                 <w:sz w:val="38"/>
               </w:rPr>
-              <w:t>{{SCOPE2}}</w:t>
+              <w:t>0.1999</w:t>
             </w:r>
           </w:p>
           <w:p>
@@ -22782,7 +22782,7 @@
                 <w:spacing w:val="-2"/>
                 <w:sz w:val="38"/>
               </w:rPr>
-              <w:t>{{SCOPE1}}</w:t>
+              <w:t>0.0000</w:t>
             </w:r>
           </w:p>
           <w:p>
@@ -22871,7 +22871,7 @@
                 <w:spacing w:val="-2"/>
                 <w:sz w:val="38"/>
               </w:rPr>
-              <w:t>{{SCOPE2}}</w:t>
+              <w:t>0.1999</w:t>
             </w:r>
           </w:p>
           <w:p>
@@ -23891,7 +23891,7 @@
                 <w:spacing w:val="-2"/>
                 <w:sz w:val="38"/>
               </w:rPr>
-              <w:t>{{SCOPE1}}</w:t>
+              <w:t>0.0000</w:t>
             </w:r>
           </w:p>
           <w:p>
@@ -23995,7 +23995,7 @@
                 <w:spacing w:val="-2"/>
                 <w:sz w:val="38"/>
               </w:rPr>
-              <w:t>{{SCOPE2}}</w:t>
+              <w:t>0.1999</w:t>
             </w:r>
           </w:p>
           <w:p>
@@ -24099,7 +24099,7 @@
                 <w:spacing w:val="-2"/>
                 <w:sz w:val="38"/>
               </w:rPr>
-              <w:t>{{SCOPE1}}</w:t>
+              <w:t>0.0000</w:t>
             </w:r>
           </w:p>
           <w:p>
@@ -24188,7 +24188,7 @@
                 <w:spacing w:val="-2"/>
                 <w:sz w:val="38"/>
               </w:rPr>
-              <w:t>{{SCOPE2}}</w:t>
+              <w:t>0.1999</w:t>
             </w:r>
           </w:p>
           <w:p>
@@ -25208,7 +25208,7 @@
                 <w:spacing w:val="-2"/>
                 <w:sz w:val="38"/>
               </w:rPr>
-              <w:t>{{SCOPE1}}</w:t>
+              <w:t>0.0000</w:t>
             </w:r>
           </w:p>
           <w:p>
@@ -25312,7 +25312,7 @@
                 <w:spacing w:val="-2"/>
                 <w:sz w:val="38"/>
               </w:rPr>
-              <w:t>{{SCOPE2}}</w:t>
+              <w:t>0.1999</w:t>
             </w:r>
           </w:p>
           <w:p>
@@ -25416,7 +25416,7 @@
                 <w:spacing w:val="-2"/>
                 <w:sz w:val="38"/>
               </w:rPr>
-              <w:t>{{SCOPE1}}</w:t>
+              <w:t>0.0000</w:t>
             </w:r>
           </w:p>
           <w:p>
@@ -25505,7 +25505,7 @@
                 <w:spacing w:val="-2"/>
                 <w:sz w:val="38"/>
               </w:rPr>
-              <w:t>{{SCOPE2}}</w:t>
+              <w:t>0.1999</w:t>
             </w:r>
           </w:p>
           <w:p>
@@ -26525,7 +26525,7 @@
                 <w:spacing w:val="-2"/>
                 <w:sz w:val="38"/>
               </w:rPr>
-              <w:t>{{SCOPE1}}</w:t>
+              <w:t>0.0000</w:t>
             </w:r>
           </w:p>
           <w:p>
@@ -26629,7 +26629,7 @@
                 <w:spacing w:val="-2"/>
                 <w:sz w:val="38"/>
               </w:rPr>
-              <w:t>{{SCOPE2}}</w:t>
+              <w:t>0.1999</w:t>
             </w:r>
           </w:p>
           <w:p>
@@ -26733,7 +26733,7 @@
                 <w:spacing w:val="-2"/>
                 <w:sz w:val="38"/>
               </w:rPr>
-              <w:t>{{SCOPE1}}</w:t>
+              <w:t>0.0000</w:t>
             </w:r>
           </w:p>
           <w:p>
@@ -26822,7 +26822,7 @@
                 <w:spacing w:val="-2"/>
                 <w:sz w:val="38"/>
               </w:rPr>
-              <w:t>{{SCOPE2}}</w:t>
+              <w:t>0.1999</w:t>
             </w:r>
           </w:p>
           <w:p>
@@ -27224,7 +27224,7 @@
                 <w:color w:val="151F34"/>
                 <w:sz w:val="17"/>
               </w:rPr>
-              <w:t>{{SCOPE2}} </w:t>
+              <w:t>0.1999 </w:t>
             </w:r>
             <w:r>
               <w:rPr>
@@ -27863,7 +27863,7 @@
                 <w:spacing w:val="-2"/>
                 <w:sz w:val="38"/>
               </w:rPr>
-              <w:t>{{SCOPE1}}</w:t>
+              <w:t>0.0000</w:t>
             </w:r>
           </w:p>
           <w:p>
@@ -27967,7 +27967,7 @@
                 <w:spacing w:val="-2"/>
                 <w:sz w:val="38"/>
               </w:rPr>
-              <w:t>{{SCOPE2}}</w:t>
+              <w:t>0.1999</w:t>
             </w:r>
           </w:p>
           <w:p>
@@ -28071,7 +28071,7 @@
                 <w:spacing w:val="-2"/>
                 <w:sz w:val="38"/>
               </w:rPr>
-              <w:t>{{SCOPE1}}</w:t>
+              <w:t>0.0000</w:t>
             </w:r>
           </w:p>
           <w:p>
@@ -28160,7 +28160,7 @@
                 <w:spacing w:val="-2"/>
                 <w:sz w:val="38"/>
               </w:rPr>
-              <w:t>{{SCOPE2}}</w:t>
+              <w:t>0.1999</w:t>
             </w:r>
           </w:p>
           <w:p>
@@ -28562,7 +28562,7 @@
                 <w:color w:val="151F34"/>
                 <w:sz w:val="17"/>
               </w:rPr>
-              <w:t>{{SCOPE2}} </w:t>
+              <w:t>0.1999 </w:t>
             </w:r>
             <w:r>
               <w:rPr>
@@ -29201,7 +29201,7 @@
                 <w:spacing w:val="-2"/>
                 <w:sz w:val="38"/>
               </w:rPr>
-              <w:t>{{SCOPE1}}</w:t>
+              <w:t>0.0000</w:t>
             </w:r>
           </w:p>
           <w:p>
@@ -29305,7 +29305,7 @@
                 <w:spacing w:val="-2"/>
                 <w:sz w:val="38"/>
               </w:rPr>
-              <w:t>{{SCOPE2}}</w:t>
+              <w:t>0.1999</w:t>
             </w:r>
           </w:p>
           <w:p>
@@ -29409,7 +29409,7 @@
                 <w:spacing w:val="-2"/>
                 <w:sz w:val="38"/>
               </w:rPr>
-              <w:t>{{SCOPE1}}</w:t>
+              <w:t>0.0000</w:t>
             </w:r>
           </w:p>
           <w:p>
@@ -29498,7 +29498,7 @@
                 <w:spacing w:val="-2"/>
                 <w:sz w:val="38"/>
               </w:rPr>
-              <w:t>{{SCOPE2}}</w:t>
+              <w:t>0.1999</w:t>
             </w:r>
           </w:p>
           <w:p>
@@ -29900,7 +29900,7 @@
                 <w:color w:val="151F34"/>
                 <w:sz w:val="17"/>
               </w:rPr>
-              <w:t>{{SCOPE2}} </w:t>
+              <w:t>0.1999 </w:t>
             </w:r>
             <w:r>
               <w:rPr>
@@ -30539,7 +30539,7 @@
                 <w:spacing w:val="-2"/>
                 <w:sz w:val="38"/>
               </w:rPr>
-              <w:t>{{SCOPE1}}</w:t>
+              <w:t>0.0000</w:t>
             </w:r>
           </w:p>
           <w:p>
@@ -30643,7 +30643,7 @@
                 <w:spacing w:val="-2"/>
                 <w:sz w:val="38"/>
               </w:rPr>
-              <w:t>{{SCOPE2}}</w:t>
+              <w:t>0.1999</w:t>
             </w:r>
           </w:p>
           <w:p>
@@ -30747,7 +30747,7 @@
                 <w:spacing w:val="-2"/>
                 <w:sz w:val="38"/>
               </w:rPr>
-              <w:t>{{SCOPE1}}</w:t>
+              <w:t>0.0000</w:t>
             </w:r>
           </w:p>
           <w:p>
@@ -30836,7 +30836,7 @@
                 <w:spacing w:val="-2"/>
                 <w:sz w:val="38"/>
               </w:rPr>
-              <w:t>{{SCOPE2}}</w:t>
+              <w:t>0.1999</w:t>
             </w:r>
           </w:p>
           <w:p>
@@ -31856,7 +31856,7 @@
                 <w:spacing w:val="-2"/>
                 <w:sz w:val="38"/>
               </w:rPr>
-              <w:t>{{SCOPE1}}</w:t>
+              <w:t>0.0000</w:t>
             </w:r>
           </w:p>
           <w:p>
@@ -31960,7 +31960,7 @@
                 <w:spacing w:val="-2"/>
                 <w:sz w:val="38"/>
               </w:rPr>
-              <w:t>{{SCOPE2}}</w:t>
+              <w:t>0.1999</w:t>
             </w:r>
           </w:p>
           <w:p>
@@ -32064,7 +32064,7 @@
                 <w:spacing w:val="-2"/>
                 <w:sz w:val="38"/>
               </w:rPr>
-              <w:t>{{SCOPE1}}</w:t>
+              <w:t>0.0000</w:t>
             </w:r>
           </w:p>
           <w:p>
@@ -32153,7 +32153,7 @@
                 <w:spacing w:val="-2"/>
                 <w:sz w:val="38"/>
               </w:rPr>
-              <w:t>{{SCOPE2}}</w:t>
+              <w:t>0.1999</w:t>
             </w:r>
           </w:p>
           <w:p>
@@ -32555,7 +32555,7 @@
                 <w:color w:val="151F34"/>
                 <w:sz w:val="17"/>
               </w:rPr>
-              <w:t>{{SCOPE2}} </w:t>
+              <w:t>0.1999 </w:t>
             </w:r>
             <w:r>
               <w:rPr>
@@ -33194,7 +33194,7 @@
                 <w:spacing w:val="-2"/>
                 <w:sz w:val="38"/>
               </w:rPr>
-              <w:t>{{SCOPE1}}</w:t>
+              <w:t>0.0000</w:t>
             </w:r>
           </w:p>
           <w:p>
@@ -33298,7 +33298,7 @@
                 <w:spacing w:val="-2"/>
                 <w:sz w:val="38"/>
               </w:rPr>
-              <w:t>{{SCOPE2}}</w:t>
+              <w:t>0.1999</w:t>
             </w:r>
           </w:p>
           <w:p>
@@ -33402,7 +33402,7 @@
                 <w:spacing w:val="-2"/>
                 <w:sz w:val="38"/>
               </w:rPr>
-              <w:t>{{SCOPE1}}</w:t>
+              <w:t>0.0000</w:t>
             </w:r>
           </w:p>
           <w:p>
@@ -33491,7 +33491,7 @@
                 <w:spacing w:val="-2"/>
                 <w:sz w:val="38"/>
               </w:rPr>
-              <w:t>{{SCOPE2}}</w:t>
+              <w:t>0.1999</w:t>
             </w:r>
           </w:p>
           <w:p>
@@ -34511,7 +34511,7 @@
                 <w:spacing w:val="-2"/>
                 <w:sz w:val="38"/>
               </w:rPr>
-              <w:t>{{SCOPE1}}</w:t>
+              <w:t>0.0000</w:t>
             </w:r>
           </w:p>
           <w:p>
@@ -34615,7 +34615,7 @@
                 <w:spacing w:val="-2"/>
                 <w:sz w:val="38"/>
               </w:rPr>
-              <w:t>{{SCOPE2}}</w:t>
+              <w:t>0.1999</w:t>
             </w:r>
           </w:p>
           <w:p>
@@ -34719,7 +34719,7 @@
                 <w:spacing w:val="-2"/>
                 <w:sz w:val="38"/>
               </w:rPr>
-              <w:t>{{SCOPE1}}</w:t>
+              <w:t>0.0000</w:t>
             </w:r>
           </w:p>
           <w:p>
@@ -34808,7 +34808,7 @@
                 <w:spacing w:val="-2"/>
                 <w:sz w:val="38"/>
               </w:rPr>
-              <w:t>{{SCOPE2}}</w:t>
+              <w:t>0.1999</w:t>
             </w:r>
           </w:p>
           <w:p>
@@ -35828,7 +35828,7 @@
                 <w:spacing w:val="-2"/>
                 <w:sz w:val="38"/>
               </w:rPr>
-              <w:t>{{SCOPE1}}</w:t>
+              <w:t>0.0000</w:t>
             </w:r>
           </w:p>
           <w:p>
@@ -35932,7 +35932,7 @@
                 <w:spacing w:val="-2"/>
                 <w:sz w:val="38"/>
               </w:rPr>
-              <w:t>{{SCOPE2}}</w:t>
+              <w:t>0.1999</w:t>
             </w:r>
           </w:p>
           <w:p>
@@ -36036,7 +36036,7 @@
                 <w:spacing w:val="-2"/>
                 <w:sz w:val="38"/>
               </w:rPr>
-              <w:t>{{SCOPE1}}</w:t>
+              <w:t>0.0000</w:t>
             </w:r>
           </w:p>
           <w:p>
@@ -36125,7 +36125,7 @@
                 <w:spacing w:val="-2"/>
                 <w:sz w:val="38"/>
               </w:rPr>
-              <w:t>{{SCOPE2}}</w:t>
+              <w:t>0.1999</w:t>
             </w:r>
           </w:p>
           <w:p>
@@ -37145,7 +37145,7 @@
                 <w:spacing w:val="-2"/>
                 <w:sz w:val="38"/>
               </w:rPr>
-              <w:t>{{SCOPE1}}</w:t>
+              <w:t>0.0000</w:t>
             </w:r>
           </w:p>
           <w:p>
@@ -37249,7 +37249,7 @@
                 <w:spacing w:val="-2"/>
                 <w:sz w:val="38"/>
               </w:rPr>
-              <w:t>{{SCOPE2}}</w:t>
+              <w:t>0.1999</w:t>
             </w:r>
           </w:p>
           <w:p>
@@ -37353,7 +37353,7 @@
                 <w:spacing w:val="-2"/>
                 <w:sz w:val="38"/>
               </w:rPr>
-              <w:t>{{SCOPE1}}</w:t>
+              <w:t>0.0000</w:t>
             </w:r>
           </w:p>
           <w:p>
@@ -37442,7 +37442,7 @@
                 <w:spacing w:val="-2"/>
                 <w:sz w:val="38"/>
               </w:rPr>
-              <w:t>{{SCOPE2}}</w:t>
+              <w:t>0.1999</w:t>
             </w:r>
           </w:p>
           <w:p>
@@ -38462,7 +38462,7 @@
                 <w:spacing w:val="-2"/>
                 <w:sz w:val="38"/>
               </w:rPr>
-              <w:t>{{SCOPE1}}</w:t>
+              <w:t>0.0000</w:t>
             </w:r>
           </w:p>
           <w:p>
@@ -38566,7 +38566,7 @@
                 <w:spacing w:val="-2"/>
                 <w:sz w:val="38"/>
               </w:rPr>
-              <w:t>{{SCOPE2}}</w:t>
+              <w:t>0.1999</w:t>
             </w:r>
           </w:p>
           <w:p>
@@ -38670,7 +38670,7 @@
                 <w:spacing w:val="-2"/>
                 <w:sz w:val="38"/>
               </w:rPr>
-              <w:t>{{SCOPE1}}</w:t>
+              <w:t>0.0000</w:t>
             </w:r>
           </w:p>
           <w:p>
@@ -38759,7 +38759,7 @@
                 <w:spacing w:val="-2"/>
                 <w:sz w:val="38"/>
               </w:rPr>
-              <w:t>{{SCOPE2}}</w:t>
+              <w:t>0.1999</w:t>
             </w:r>
           </w:p>
           <w:p>
@@ -39779,7 +39779,7 @@
                 <w:spacing w:val="-2"/>
                 <w:sz w:val="38"/>
               </w:rPr>
-              <w:t>{{SCOPE1}}</w:t>
+              <w:t>0.0000</w:t>
             </w:r>
           </w:p>
           <w:p>
@@ -39883,7 +39883,7 @@
                 <w:spacing w:val="-2"/>
                 <w:sz w:val="38"/>
               </w:rPr>
-              <w:t>{{SCOPE2}}</w:t>
+              <w:t>0.1999</w:t>
             </w:r>
           </w:p>
           <w:p>
@@ -39987,7 +39987,7 @@
                 <w:spacing w:val="-2"/>
                 <w:sz w:val="38"/>
               </w:rPr>
-              <w:t>{{SCOPE1}}</w:t>
+              <w:t>0.0000</w:t>
             </w:r>
           </w:p>
           <w:p>
@@ -40076,7 +40076,7 @@
                 <w:spacing w:val="-2"/>
                 <w:sz w:val="38"/>
               </w:rPr>
-              <w:t>{{SCOPE2}}</w:t>
+              <w:t>0.1999</w:t>
             </w:r>
           </w:p>
           <w:p>
@@ -41096,7 +41096,7 @@
                 <w:spacing w:val="-2"/>
                 <w:sz w:val="38"/>
               </w:rPr>
-              <w:t>{{SCOPE1}}</w:t>
+              <w:t>0.0000</w:t>
             </w:r>
           </w:p>
           <w:p>
@@ -41200,7 +41200,7 @@
                 <w:spacing w:val="-2"/>
                 <w:sz w:val="38"/>
               </w:rPr>
-              <w:t>{{SCOPE2}}</w:t>
+              <w:t>0.1999</w:t>
             </w:r>
           </w:p>
           <w:p>
@@ -41304,7 +41304,7 @@
                 <w:spacing w:val="-2"/>
                 <w:sz w:val="38"/>
               </w:rPr>
-              <w:t>{{SCOPE1}}</w:t>
+              <w:t>0.0000</w:t>
             </w:r>
           </w:p>
           <w:p>
@@ -41393,7 +41393,7 @@
                 <w:spacing w:val="-2"/>
                 <w:sz w:val="38"/>
               </w:rPr>
-              <w:t>{{SCOPE2}}</w:t>
+              <w:t>0.1999</w:t>
             </w:r>
           </w:p>
           <w:p>
@@ -42413,7 +42413,7 @@
                 <w:spacing w:val="-2"/>
                 <w:sz w:val="38"/>
               </w:rPr>
-              <w:t>{{SCOPE1}}</w:t>
+              <w:t>0.0000</w:t>
             </w:r>
           </w:p>
           <w:p>
@@ -42517,7 +42517,7 @@
                 <w:spacing w:val="-2"/>
                 <w:sz w:val="38"/>
               </w:rPr>
-              <w:t>{{SCOPE2}}</w:t>
+              <w:t>0.1999</w:t>
             </w:r>
           </w:p>
           <w:p>
@@ -42621,7 +42621,7 @@
                 <w:spacing w:val="-2"/>
                 <w:sz w:val="38"/>
               </w:rPr>
-              <w:t>{{SCOPE1}}</w:t>
+              <w:t>0.0000</w:t>
             </w:r>
           </w:p>
           <w:p>
@@ -42710,7 +42710,7 @@
                 <w:spacing w:val="-2"/>
                 <w:sz w:val="38"/>
               </w:rPr>
-              <w:t>{{SCOPE2}}</w:t>
+              <w:t>0.1999</w:t>
             </w:r>
           </w:p>
           <w:p>
@@ -43730,7 +43730,7 @@
                 <w:spacing w:val="-2"/>
                 <w:sz w:val="38"/>
               </w:rPr>
-              <w:t>{{SCOPE1}}</w:t>
+              <w:t>0.0000</w:t>
             </w:r>
           </w:p>
           <w:p>
@@ -43834,7 +43834,7 @@
                 <w:spacing w:val="-2"/>
                 <w:sz w:val="38"/>
               </w:rPr>
-              <w:t>{{SCOPE2}}</w:t>
+              <w:t>0.1999</w:t>
             </w:r>
           </w:p>
           <w:p>
@@ -43938,7 +43938,7 @@
                 <w:spacing w:val="-2"/>
                 <w:sz w:val="38"/>
               </w:rPr>
-              <w:t>{{SCOPE1}}</w:t>
+              <w:t>0.0000</w:t>
             </w:r>
           </w:p>
           <w:p>
@@ -44027,7 +44027,7 @@
                 <w:spacing w:val="-2"/>
                 <w:sz w:val="38"/>
               </w:rPr>
-              <w:t>{{SCOPE2}}</w:t>
+              <w:t>0.1999</w:t>
             </w:r>
           </w:p>
           <w:p>
@@ -45047,7 +45047,7 @@
                 <w:spacing w:val="-2"/>
                 <w:sz w:val="38"/>
               </w:rPr>
-              <w:t>{{SCOPE1}}</w:t>
+              <w:t>0.0000</w:t>
             </w:r>
           </w:p>
           <w:p>
@@ -45151,7 +45151,7 @@
                 <w:spacing w:val="-2"/>
                 <w:sz w:val="38"/>
               </w:rPr>
-              <w:t>{{SCOPE2}}</w:t>
+              <w:t>0.1999</w:t>
             </w:r>
           </w:p>
           <w:p>
@@ -45255,7 +45255,7 @@
                 <w:spacing w:val="-2"/>
                 <w:sz w:val="38"/>
               </w:rPr>
-              <w:t>{{SCOPE1}}</w:t>
+              <w:t>0.0000</w:t>
             </w:r>
           </w:p>
           <w:p>
@@ -45344,7 +45344,7 @@
                 <w:spacing w:val="-2"/>
                 <w:sz w:val="38"/>
               </w:rPr>
-              <w:t>{{SCOPE2}}</w:t>
+              <w:t>0.1999</w:t>
             </w:r>
           </w:p>
           <w:p>
@@ -46364,7 +46364,7 @@
                 <w:spacing w:val="-2"/>
                 <w:sz w:val="38"/>
               </w:rPr>
-              <w:t>{{SCOPE1}}</w:t>
+              <w:t>0.0000</w:t>
             </w:r>
           </w:p>
           <w:p>
@@ -46468,7 +46468,7 @@
                 <w:spacing w:val="-2"/>
                 <w:sz w:val="38"/>
               </w:rPr>
-              <w:t>{{SCOPE2}}</w:t>
+              <w:t>0.1999</w:t>
             </w:r>
           </w:p>
           <w:p>
@@ -46572,7 +46572,7 @@
                 <w:spacing w:val="-2"/>
                 <w:sz w:val="38"/>
               </w:rPr>
-              <w:t>{{SCOPE1}}</w:t>
+              <w:t>0.0000</w:t>
             </w:r>
           </w:p>
           <w:p>
@@ -46661,7 +46661,7 @@
                 <w:spacing w:val="-2"/>
                 <w:sz w:val="38"/>
               </w:rPr>
-              <w:t>{{SCOPE2}}</w:t>
+              <w:t>0.1999</w:t>
             </w:r>
           </w:p>
           <w:p>
@@ -47681,7 +47681,7 @@
                 <w:spacing w:val="-2"/>
                 <w:sz w:val="38"/>
               </w:rPr>
-              <w:t>{{SCOPE1}}</w:t>
+              <w:t>0.0000</w:t>
             </w:r>
           </w:p>
           <w:p>
@@ -47785,7 +47785,7 @@
                 <w:spacing w:val="-2"/>
                 <w:sz w:val="38"/>
               </w:rPr>
-              <w:t>{{SCOPE2}}</w:t>
+              <w:t>0.1999</w:t>
             </w:r>
           </w:p>
           <w:p>
@@ -47889,7 +47889,7 @@
                 <w:spacing w:val="-2"/>
                 <w:sz w:val="38"/>
               </w:rPr>
-              <w:t>{{SCOPE1}}</w:t>
+              <w:t>0.0000</w:t>
             </w:r>
           </w:p>
           <w:p>
@@ -47978,7 +47978,7 @@
                 <w:spacing w:val="-2"/>
                 <w:sz w:val="38"/>
               </w:rPr>
-              <w:t>{{SCOPE2}}</w:t>
+              <w:t>0.1999</w:t>
             </w:r>
           </w:p>
           <w:p>
@@ -48998,7 +48998,7 @@
                 <w:spacing w:val="-2"/>
                 <w:sz w:val="38"/>
               </w:rPr>
-              <w:t>{{SCOPE1}}</w:t>
+              <w:t>0.0000</w:t>
             </w:r>
           </w:p>
           <w:p>
@@ -49102,7 +49102,7 @@
                 <w:spacing w:val="-2"/>
                 <w:sz w:val="38"/>
               </w:rPr>
-              <w:t>{{SCOPE2}}</w:t>
+              <w:t>0.1999</w:t>
             </w:r>
           </w:p>
           <w:p>
@@ -49206,7 +49206,7 @@
                 <w:spacing w:val="-2"/>
                 <w:sz w:val="38"/>
               </w:rPr>
-              <w:t>{{SCOPE1}}</w:t>
+              <w:t>0.0000</w:t>
             </w:r>
           </w:p>
           <w:p>
@@ -49295,7 +49295,7 @@
                 <w:spacing w:val="-2"/>
                 <w:sz w:val="38"/>
               </w:rPr>
-              <w:t>{{SCOPE2}}</w:t>
+              <w:t>0.1999</w:t>
             </w:r>
           </w:p>
           <w:p>
@@ -50315,7 +50315,7 @@
                 <w:spacing w:val="-2"/>
                 <w:sz w:val="38"/>
               </w:rPr>
-              <w:t>{{SCOPE1}}</w:t>
+              <w:t>0.0000</w:t>
             </w:r>
           </w:p>
           <w:p>
@@ -50419,7 +50419,7 @@
                 <w:spacing w:val="-2"/>
                 <w:sz w:val="38"/>
               </w:rPr>
-              <w:t>{{SCOPE2}}</w:t>
+              <w:t>0.1999</w:t>
             </w:r>
           </w:p>
           <w:p>
@@ -50523,7 +50523,7 @@
                 <w:spacing w:val="-2"/>
                 <w:sz w:val="38"/>
               </w:rPr>
-              <w:t>{{SCOPE1}}</w:t>
+              <w:t>0.0000</w:t>
             </w:r>
           </w:p>
           <w:p>
@@ -50612,7 +50612,7 @@
                 <w:spacing w:val="-2"/>
                 <w:sz w:val="38"/>
               </w:rPr>
-              <w:t>{{SCOPE2}}</w:t>
+              <w:t>0.1999</w:t>
             </w:r>
           </w:p>
           <w:p>
@@ -51632,7 +51632,7 @@
                 <w:spacing w:val="-2"/>
                 <w:sz w:val="38"/>
               </w:rPr>
-              <w:t>{{SCOPE1}}</w:t>
+              <w:t>0.0000</w:t>
             </w:r>
           </w:p>
           <w:p>
@@ -51736,7 +51736,7 @@
                 <w:spacing w:val="-2"/>
                 <w:sz w:val="38"/>
               </w:rPr>
-              <w:t>{{SCOPE2}}</w:t>
+              <w:t>0.1999</w:t>
             </w:r>
           </w:p>
           <w:p>
@@ -51840,7 +51840,7 @@
                 <w:spacing w:val="-2"/>
                 <w:sz w:val="38"/>
               </w:rPr>
-              <w:t>{{SCOPE1}}</w:t>
+              <w:t>0.0000</w:t>
             </w:r>
           </w:p>
           <w:p>
@@ -51929,7 +51929,7 @@
                 <w:spacing w:val="-2"/>
                 <w:sz w:val="38"/>
               </w:rPr>
-              <w:t>{{SCOPE2}}</w:t>
+              <w:t>0.1999</w:t>
             </w:r>
           </w:p>
           <w:p>
@@ -52949,7 +52949,7 @@
                 <w:spacing w:val="-2"/>
                 <w:sz w:val="38"/>
               </w:rPr>
-              <w:t>{{SCOPE1}}</w:t>
+              <w:t>0.0000</w:t>
             </w:r>
           </w:p>
           <w:p>
@@ -53053,7 +53053,7 @@
                 <w:spacing w:val="-2"/>
                 <w:sz w:val="38"/>
               </w:rPr>
-              <w:t>{{SCOPE2}}</w:t>
+              <w:t>0.1999</w:t>
             </w:r>
           </w:p>
           <w:p>
@@ -53157,7 +53157,7 @@
                 <w:spacing w:val="-2"/>
                 <w:sz w:val="38"/>
               </w:rPr>
-              <w:t>{{SCOPE1}}</w:t>
+              <w:t>0.0000</w:t>
             </w:r>
           </w:p>
           <w:p>
@@ -53246,7 +53246,7 @@
                 <w:spacing w:val="-2"/>
                 <w:sz w:val="38"/>
               </w:rPr>
-              <w:t>{{SCOPE2}}</w:t>
+              <w:t>0.1999</w:t>
             </w:r>
           </w:p>
           <w:p>
@@ -54266,7 +54266,7 @@
                 <w:spacing w:val="-2"/>
                 <w:sz w:val="38"/>
               </w:rPr>
-              <w:t>{{SCOPE1}}</w:t>
+              <w:t>0.0000</w:t>
             </w:r>
           </w:p>
           <w:p>
@@ -54370,7 +54370,7 @@
                 <w:spacing w:val="-2"/>
                 <w:sz w:val="38"/>
               </w:rPr>
-              <w:t>{{SCOPE2}}</w:t>
+              <w:t>0.1999</w:t>
             </w:r>
           </w:p>
           <w:p>
@@ -54474,7 +54474,7 @@
                 <w:spacing w:val="-2"/>
                 <w:sz w:val="38"/>
               </w:rPr>
-              <w:t>{{SCOPE1}}</w:t>
+              <w:t>0.0000</w:t>
             </w:r>
           </w:p>
           <w:p>
@@ -54563,7 +54563,7 @@
                 <w:spacing w:val="-2"/>
                 <w:sz w:val="38"/>
               </w:rPr>
-              <w:t>{{SCOPE2}}</w:t>
+              <w:t>0.1999</w:t>
             </w:r>
           </w:p>
           <w:p>
@@ -55583,7 +55583,7 @@
                 <w:spacing w:val="-2"/>
                 <w:sz w:val="38"/>
               </w:rPr>
-              <w:t>{{SCOPE1}}</w:t>
+              <w:t>0.0000</w:t>
             </w:r>
           </w:p>
           <w:p>
@@ -55687,7 +55687,7 @@
                 <w:spacing w:val="-2"/>
                 <w:sz w:val="38"/>
               </w:rPr>
-              <w:t>{{SCOPE2}}</w:t>
+              <w:t>0.1999</w:t>
             </w:r>
           </w:p>
           <w:p>
@@ -55791,7 +55791,7 @@
                 <w:spacing w:val="-2"/>
                 <w:sz w:val="38"/>
               </w:rPr>
-              <w:t>{{SCOPE1}}</w:t>
+              <w:t>0.0000</w:t>
             </w:r>
           </w:p>
           <w:p>
@@ -55880,7 +55880,7 @@
                 <w:spacing w:val="-2"/>
                 <w:sz w:val="38"/>
               </w:rPr>
-              <w:t>{{SCOPE2}}</w:t>
+              <w:t>0.1999</w:t>
             </w:r>
           </w:p>
           <w:p>
@@ -56900,7 +56900,7 @@
                 <w:spacing w:val="-2"/>
                 <w:sz w:val="38"/>
               </w:rPr>
-              <w:t>{{SCOPE1}}</w:t>
+              <w:t>0.0000</w:t>
             </w:r>
           </w:p>
           <w:p>
@@ -57004,7 +57004,7 @@
                 <w:spacing w:val="-2"/>
                 <w:sz w:val="38"/>
               </w:rPr>
-              <w:t>{{SCOPE2}}</w:t>
+              <w:t>0.1999</w:t>
             </w:r>
           </w:p>
           <w:p>
@@ -57108,7 +57108,7 @@
                 <w:spacing w:val="-2"/>
                 <w:sz w:val="38"/>
               </w:rPr>
-              <w:t>{{SCOPE1}}</w:t>
+              <w:t>0.0000</w:t>
             </w:r>
           </w:p>
           <w:p>
@@ -57197,7 +57197,7 @@
                 <w:spacing w:val="-2"/>
                 <w:sz w:val="38"/>
               </w:rPr>
-              <w:t>{{SCOPE2}}</w:t>
+              <w:t>0.1999</w:t>
             </w:r>
           </w:p>
           <w:p>
@@ -58217,7 +58217,7 @@
                 <w:spacing w:val="-2"/>
                 <w:sz w:val="38"/>
               </w:rPr>
-              <w:t>{{SCOPE1}}</w:t>
+              <w:t>0.0000</w:t>
             </w:r>
           </w:p>
           <w:p>
@@ -58321,7 +58321,7 @@
                 <w:spacing w:val="-2"/>
                 <w:sz w:val="38"/>
               </w:rPr>
-              <w:t>{{SCOPE2}}</w:t>
+              <w:t>0.1999</w:t>
             </w:r>
           </w:p>
           <w:p>
@@ -58425,7 +58425,7 @@
                 <w:spacing w:val="-2"/>
                 <w:sz w:val="38"/>
               </w:rPr>
-              <w:t>{{SCOPE1}}</w:t>
+              <w:t>0.0000</w:t>
             </w:r>
           </w:p>
           <w:p>
@@ -58514,7 +58514,7 @@
                 <w:spacing w:val="-2"/>
                 <w:sz w:val="38"/>
               </w:rPr>
-              <w:t>{{SCOPE2}}</w:t>
+              <w:t>0.1999</w:t>
             </w:r>
           </w:p>
           <w:p>
@@ -59534,7 +59534,7 @@
                 <w:spacing w:val="-2"/>
                 <w:sz w:val="38"/>
               </w:rPr>
-              <w:t>{{SCOPE1}}</w:t>
+              <w:t>0.0000</w:t>
             </w:r>
           </w:p>
           <w:p>
@@ -59638,7 +59638,7 @@
                 <w:spacing w:val="-2"/>
                 <w:sz w:val="38"/>
               </w:rPr>
-              <w:t>{{SCOPE2}}</w:t>
+              <w:t>0.1999</w:t>
             </w:r>
           </w:p>
           <w:p>
@@ -59742,7 +59742,7 @@
                 <w:spacing w:val="-2"/>
                 <w:sz w:val="38"/>
               </w:rPr>
-              <w:t>{{SCOPE1}}</w:t>
+              <w:t>0.0000</w:t>
             </w:r>
           </w:p>
           <w:p>
@@ -59831,7 +59831,7 @@
                 <w:spacing w:val="-2"/>
                 <w:sz w:val="38"/>
               </w:rPr>
-              <w:t>{{SCOPE2}}</w:t>
+              <w:t>0.1999</w:t>
             </w:r>
           </w:p>
           <w:p>
@@ -60851,7 +60851,7 @@
                 <w:spacing w:val="-2"/>
                 <w:sz w:val="38"/>
               </w:rPr>
-              <w:t>{{SCOPE1}}</w:t>
+              <w:t>0.0000</w:t>
             </w:r>
           </w:p>
           <w:p>
@@ -60955,7 +60955,7 @@
                 <w:spacing w:val="-2"/>
                 <w:sz w:val="38"/>
               </w:rPr>
-              <w:t>{{SCOPE2}}</w:t>
+              <w:t>0.1999</w:t>
             </w:r>
           </w:p>
           <w:p>
@@ -61059,7 +61059,7 @@
                 <w:spacing w:val="-2"/>
                 <w:sz w:val="38"/>
               </w:rPr>
-              <w:t>{{SCOPE1}}</w:t>
+              <w:t>0.0000</w:t>
             </w:r>
           </w:p>
           <w:p>
@@ -61148,7 +61148,7 @@
                 <w:spacing w:val="-2"/>
                 <w:sz w:val="38"/>
               </w:rPr>
-              <w:t>{{SCOPE2}}</w:t>
+              <w:t>0.1999</w:t>
             </w:r>
           </w:p>
           <w:p>
@@ -62168,7 +62168,7 @@
                 <w:spacing w:val="-2"/>
                 <w:sz w:val="38"/>
               </w:rPr>
-              <w:t>{{SCOPE1}}</w:t>
+              <w:t>0.0000</w:t>
             </w:r>
           </w:p>
           <w:p>
@@ -62272,7 +62272,7 @@
                 <w:spacing w:val="-2"/>
                 <w:sz w:val="38"/>
               </w:rPr>
-              <w:t>{{SCOPE2}}</w:t>
+              <w:t>0.1999</w:t>
             </w:r>
           </w:p>
           <w:p>
@@ -62376,7 +62376,7 @@
                 <w:spacing w:val="-2"/>
                 <w:sz w:val="38"/>
               </w:rPr>
-              <w:t>{{SCOPE1}}</w:t>
+              <w:t>0.0000</w:t>
             </w:r>
           </w:p>
           <w:p>
@@ -62465,7 +62465,7 @@
                 <w:spacing w:val="-2"/>
                 <w:sz w:val="38"/>
               </w:rPr>
-              <w:t>{{SCOPE2}}</w:t>
+              <w:t>0.1999</w:t>
             </w:r>
           </w:p>
           <w:p>
@@ -63616,7 +63616,7 @@
                 <w:spacing w:val="-2"/>
                 <w:sz w:val="38"/>
               </w:rPr>
-              <w:t>{{SCOPE1}}</w:t>
+              <w:t>0.0000</w:t>
             </w:r>
           </w:p>
           <w:p>
@@ -63720,7 +63720,7 @@
                 <w:spacing w:val="-2"/>
                 <w:sz w:val="38"/>
               </w:rPr>
-              <w:t>{{SCOPE2}}</w:t>
+              <w:t>0.1999</w:t>
             </w:r>
           </w:p>
           <w:p>
@@ -63824,7 +63824,7 @@
                 <w:spacing w:val="-2"/>
                 <w:sz w:val="38"/>
               </w:rPr>
-              <w:t>{{SCOPE1}}</w:t>
+              <w:t>0.0000</w:t>
             </w:r>
           </w:p>
           <w:p>
@@ -63913,7 +63913,7 @@
                 <w:spacing w:val="-2"/>
                 <w:sz w:val="38"/>
               </w:rPr>
-              <w:t>{{SCOPE2}}</w:t>
+              <w:t>0.1999</w:t>
             </w:r>
           </w:p>
           <w:p>

</xml_diff>